<commit_message>
finished szwoch's fixes and added some history
</commit_message>
<xml_diff>
--- a/documents/praca_dyplomowa_ver1.1.docx
+++ b/documents/praca_dyplomowa_ver1.1.docx
@@ -4,7 +4,7 @@
   <w:body>
     <w:p>
       <w:pPr>
-        <w:pStyle w:val="Tytu"/>
+        <w:pStyle w:val="Title"/>
         <w:spacing w:before="240" w:after="120"/>
         <w:rPr>
           <w:rFonts w:ascii="Arial" w:hAnsi="Arial" w:cs="Arial"/>
@@ -73,31 +73,6 @@
           <w:sz w:val="20"/>
           <w:szCs w:val="20"/>
         </w:rPr>
-      </w:r>
-    </w:p>
-    <w:p>
-      <w:pPr>
-        <w:pStyle w:val="Normal"/>
-        <w:spacing w:before="240" w:after="120"/>
-        <w:rPr>
-          <w:rFonts w:ascii="Arial" w:hAnsi="Arial" w:cs="Arial"/>
-          <w:bCs/>
-          <w:strike w:val="false"/>
-          <w:dstrike w:val="false"/>
-          <w:sz w:val="20"/>
-          <w:szCs w:val="20"/>
-        </w:rPr>
-      </w:pPr>
-      <w:r>
-        <w:rPr>
-          <w:rFonts w:cs="Arial" w:ascii="Arial" w:hAnsi="Arial"/>
-          <w:bCs/>
-          <w:strike w:val="false"/>
-          <w:dstrike w:val="false"/>
-          <w:sz w:val="20"/>
-          <w:szCs w:val="20"/>
-        </w:rPr>
-        <w:t>WERSJA: 1.2</w:t>
       </w:r>
     </w:p>
     <w:p>
@@ -112,10 +87,12 @@
           <w:docGrid w:type="default" w:linePitch="360" w:charSpace="0"/>
         </w:sectPr>
         <w:pStyle w:val="Normal"/>
+        <w:spacing w:before="240" w:after="120"/>
         <w:rPr>
           <w:rFonts w:ascii="Arial" w:hAnsi="Arial" w:cs="Arial"/>
           <w:bCs/>
-          <w:strike/>
+          <w:strike w:val="false"/>
+          <w:dstrike w:val="false"/>
           <w:sz w:val="20"/>
           <w:szCs w:val="20"/>
         </w:rPr>
@@ -124,15 +101,17 @@
         <w:rPr>
           <w:rFonts w:cs="Arial" w:ascii="Arial" w:hAnsi="Arial"/>
           <w:bCs/>
-          <w:strike/>
-          <w:sz w:val="20"/>
-          <w:szCs w:val="20"/>
-        </w:rPr>
-      </w:r>
-    </w:p>
-    <w:p>
-      <w:pPr>
-        <w:pStyle w:val="Tytu"/>
+          <w:strike w:val="false"/>
+          <w:dstrike w:val="false"/>
+          <w:sz w:val="20"/>
+          <w:szCs w:val="20"/>
+        </w:rPr>
+        <w:t>WERSJA: 1.2</w:t>
+      </w:r>
+    </w:p>
+    <w:p>
+      <w:pPr>
+        <w:pStyle w:val="Title"/>
         <w:rPr/>
       </w:pPr>
       <w:r>
@@ -191,15 +170,7 @@
           <w:sz w:val="20"/>
           <w:szCs w:val="20"/>
         </w:rPr>
-        <w:t xml:space="preserve">Celem niniejszej pracy było stworzenie dwuosobowej gry </w:t>
-      </w:r>
-      <w:r>
-        <w:rPr>
-          <w:rFonts w:cs="Arial" w:ascii="Arial" w:hAnsi="Arial"/>
-          <w:sz w:val="20"/>
-          <w:szCs w:val="20"/>
-        </w:rPr>
-        <w:t>w wirtualnej rzeczywistości (ang.</w:t>
+        <w:t>Celem niniejszej pracy było stworzenie dwuosobowej gry w wirtualnej rzeczywistości (ang.</w:t>
       </w:r>
       <w:r>
         <w:rPr>
@@ -247,7 +218,126 @@
           <w:sz w:val="20"/>
           <w:szCs w:val="20"/>
         </w:rPr>
-        <w:t xml:space="preserve">wykorzystywała specjalną bibliotekę, dzięki której można było uruchomić grę w </w:t>
+        <w:t>wykorzystywała specjalną bibliotekę, dzięki której można było uruchomić grę w Laboratorium Zanurzonej Wizualizacji Przestrzennej (LZWP)</w:t>
+      </w:r>
+      <w:r>
+        <w:rPr>
+          <w:rFonts w:cs="Arial" w:ascii="Arial" w:hAnsi="Arial"/>
+          <w:sz w:val="20"/>
+          <w:szCs w:val="20"/>
+        </w:rPr>
+        <w:t>. Rozgrywka polega na wspólnym pokonywaniu duchów przez dwóch graczy – bez kooperacji nie jest możliwe ukończenie gry.</w:t>
+      </w:r>
+    </w:p>
+    <w:p>
+      <w:pPr>
+        <w:pStyle w:val="Normal"/>
+        <w:spacing w:lineRule="auto" w:line="360" w:before="0" w:after="120"/>
+        <w:ind w:firstLine="708"/>
+        <w:jc w:val="both"/>
+        <w:rPr>
+          <w:rFonts w:ascii="Arial" w:hAnsi="Arial" w:cs="Arial"/>
+          <w:sz w:val="20"/>
+          <w:szCs w:val="20"/>
+          <w:lang w:val="en-GB"/>
+        </w:rPr>
+      </w:pPr>
+      <w:r>
+        <w:rPr>
+          <w:rFonts w:cs="Arial" w:ascii="Arial" w:hAnsi="Arial"/>
+          <w:sz w:val="20"/>
+          <w:szCs w:val="20"/>
+        </w:rPr>
+        <w:t xml:space="preserve">Praca ta opisuje proces zapoznawania się z charakterystyką nowego oprogramowania LZWP oraz tworzenia gry dostosowanej pod to oprogramowanie – od ogólnych konceptów i planowania rozgrywki po analizę i testowanie synchronizacji obrazów w samym laboratorium. </w:t>
+      </w:r>
+    </w:p>
+    <w:p>
+      <w:pPr>
+        <w:pStyle w:val="Normal"/>
+        <w:spacing w:lineRule="auto" w:line="360" w:before="0" w:after="120"/>
+        <w:ind w:firstLine="708"/>
+        <w:jc w:val="both"/>
+        <w:rPr>
+          <w:rFonts w:ascii="Arial" w:hAnsi="Arial" w:cs="Arial"/>
+          <w:sz w:val="20"/>
+          <w:szCs w:val="20"/>
+          <w:lang w:val="en-GB"/>
+        </w:rPr>
+      </w:pPr>
+      <w:r>
+        <w:rPr>
+          <w:rFonts w:cs="Arial" w:ascii="Arial" w:hAnsi="Arial"/>
+          <w:sz w:val="20"/>
+          <w:szCs w:val="20"/>
+        </w:rPr>
+        <w:t>Jakub Barwa był odpowiedzialny za …</w:t>
+      </w:r>
+    </w:p>
+    <w:p>
+      <w:pPr>
+        <w:pStyle w:val="Normal"/>
+        <w:spacing w:lineRule="auto" w:line="360" w:before="0" w:after="120"/>
+        <w:ind w:firstLine="708"/>
+        <w:jc w:val="both"/>
+        <w:rPr>
+          <w:rFonts w:ascii="Arial" w:hAnsi="Arial" w:cs="Arial"/>
+          <w:sz w:val="20"/>
+          <w:szCs w:val="20"/>
+          <w:lang w:val="en-GB"/>
+        </w:rPr>
+      </w:pPr>
+      <w:r>
+        <w:rPr>
+          <w:rFonts w:cs="Arial" w:ascii="Arial" w:hAnsi="Arial"/>
+          <w:sz w:val="20"/>
+          <w:szCs w:val="20"/>
+        </w:rPr>
+        <w:t>Zofia Drożdż była odpowiedzialna za …</w:t>
+      </w:r>
+    </w:p>
+    <w:p>
+      <w:pPr>
+        <w:pStyle w:val="Normal"/>
+        <w:spacing w:lineRule="auto" w:line="360" w:before="0" w:after="120"/>
+        <w:ind w:firstLine="708"/>
+        <w:jc w:val="both"/>
+        <w:rPr>
+          <w:rFonts w:ascii="Arial" w:hAnsi="Arial" w:cs="Arial"/>
+          <w:sz w:val="20"/>
+          <w:szCs w:val="20"/>
+          <w:lang w:val="en-GB"/>
+        </w:rPr>
+      </w:pPr>
+      <w:r>
+        <w:rPr>
+          <w:rFonts w:cs="Arial" w:ascii="Arial" w:hAnsi="Arial"/>
+          <w:sz w:val="20"/>
+          <w:szCs w:val="20"/>
+        </w:rPr>
+        <w:t>Piotr Staszko był odpowiedzialny za ...</w:t>
+      </w:r>
+    </w:p>
+    <w:p>
+      <w:pPr>
+        <w:pStyle w:val="Normal"/>
+        <w:spacing w:lineRule="auto" w:line="360" w:before="0" w:after="120"/>
+        <w:rPr>
+          <w:rFonts w:ascii="Arial" w:hAnsi="Arial" w:cs="Arial"/>
+          <w:b/>
+          <w:sz w:val="20"/>
+          <w:szCs w:val="20"/>
+          <w:lang w:val="en-GB"/>
+        </w:rPr>
+      </w:pPr>
+      <w:r>
+        <w:rPr>
+          <w:rFonts w:cs="Arial" w:ascii="Arial" w:hAnsi="Arial"/>
+          <w:b/>
+          <w:sz w:val="20"/>
+          <w:szCs w:val="20"/>
+          <w:lang w:val="en-GB"/>
+        </w:rPr>
+        <w:t xml:space="preserve">Słowa kluczowe: </w:t>
       </w:r>
       <w:r>
         <w:rPr>
@@ -256,156 +346,6 @@
           <w:bCs w:val="false"/>
           <w:sz w:val="20"/>
           <w:szCs w:val="20"/>
-        </w:rPr>
-        <w:t>Laboratorium Zanurzonej Wizualizacji Przestrzennej (</w:t>
-      </w:r>
-      <w:r>
-        <w:rPr>
-          <w:rFonts w:cs="Arial" w:ascii="Arial" w:hAnsi="Arial"/>
-          <w:b w:val="false"/>
-          <w:bCs w:val="false"/>
-          <w:sz w:val="20"/>
-          <w:szCs w:val="20"/>
-        </w:rPr>
-        <w:t>LZWP</w:t>
-      </w:r>
-      <w:r>
-        <w:rPr>
-          <w:rFonts w:cs="Arial" w:ascii="Arial" w:hAnsi="Arial"/>
-          <w:b w:val="false"/>
-          <w:bCs w:val="false"/>
-          <w:sz w:val="20"/>
-          <w:szCs w:val="20"/>
-        </w:rPr>
-        <w:t>)</w:t>
-      </w:r>
-      <w:r>
-        <w:rPr>
-          <w:rFonts w:cs="Arial" w:ascii="Arial" w:hAnsi="Arial"/>
-          <w:sz w:val="20"/>
-          <w:szCs w:val="20"/>
-        </w:rPr>
-        <w:t>. Rozgrywka polega na wspólnym pokonywaniu duchów przez dwóch graczy – bez kooperacji nie jest możliwe ukończenie gry.</w:t>
-      </w:r>
-    </w:p>
-    <w:p>
-      <w:pPr>
-        <w:pStyle w:val="Normal"/>
-        <w:spacing w:lineRule="auto" w:line="360" w:before="0" w:after="120"/>
-        <w:ind w:firstLine="708"/>
-        <w:jc w:val="both"/>
-        <w:rPr>
-          <w:rFonts w:ascii="Arial" w:hAnsi="Arial" w:cs="Arial"/>
-          <w:sz w:val="20"/>
-          <w:szCs w:val="20"/>
-          <w:lang w:val="en-GB"/>
-        </w:rPr>
-      </w:pPr>
-      <w:r>
-        <w:rPr>
-          <w:rFonts w:cs="Arial" w:ascii="Arial" w:hAnsi="Arial"/>
-          <w:sz w:val="20"/>
-          <w:szCs w:val="20"/>
-        </w:rPr>
-        <w:t xml:space="preserve">Praca ta opisuje proces zapoznawania się z charakterystyką nowego oprogramowania LZWP oraz tworzenia gry dostosowanej pod to oprogramowanie – od ogólnych konceptów i planowania rozgrywki po analizę i testowanie synchronizacji obrazów w samym laboratorium. </w:t>
-      </w:r>
-    </w:p>
-    <w:p>
-      <w:pPr>
-        <w:pStyle w:val="Normal"/>
-        <w:spacing w:lineRule="auto" w:line="360" w:before="0" w:after="120"/>
-        <w:ind w:firstLine="708"/>
-        <w:jc w:val="both"/>
-        <w:rPr>
-          <w:rFonts w:ascii="Arial" w:hAnsi="Arial" w:cs="Arial"/>
-          <w:sz w:val="20"/>
-          <w:szCs w:val="20"/>
-          <w:lang w:val="en-GB"/>
-        </w:rPr>
-      </w:pPr>
-      <w:r>
-        <w:rPr>
-          <w:rFonts w:cs="Arial" w:ascii="Arial" w:hAnsi="Arial"/>
-          <w:sz w:val="20"/>
-          <w:szCs w:val="20"/>
-        </w:rPr>
-        <w:t>Jakub Barwa był odpowiedzialny za …</w:t>
-      </w:r>
-    </w:p>
-    <w:p>
-      <w:pPr>
-        <w:pStyle w:val="Normal"/>
-        <w:spacing w:lineRule="auto" w:line="360" w:before="0" w:after="120"/>
-        <w:ind w:firstLine="708"/>
-        <w:jc w:val="both"/>
-        <w:rPr>
-          <w:rFonts w:ascii="Arial" w:hAnsi="Arial" w:cs="Arial"/>
-          <w:sz w:val="20"/>
-          <w:szCs w:val="20"/>
-          <w:lang w:val="en-GB"/>
-        </w:rPr>
-      </w:pPr>
-      <w:r>
-        <w:rPr>
-          <w:rFonts w:cs="Arial" w:ascii="Arial" w:hAnsi="Arial"/>
-          <w:sz w:val="20"/>
-          <w:szCs w:val="20"/>
-        </w:rPr>
-        <w:t>Zofia Drożdż była odpowiedzialna za …</w:t>
-      </w:r>
-    </w:p>
-    <w:p>
-      <w:pPr>
-        <w:pStyle w:val="Normal"/>
-        <w:spacing w:lineRule="auto" w:line="360" w:before="0" w:after="120"/>
-        <w:ind w:firstLine="708"/>
-        <w:jc w:val="both"/>
-        <w:rPr>
-          <w:rFonts w:ascii="Arial" w:hAnsi="Arial" w:cs="Arial"/>
-          <w:sz w:val="20"/>
-          <w:szCs w:val="20"/>
-          <w:lang w:val="en-GB"/>
-        </w:rPr>
-      </w:pPr>
-      <w:r>
-        <w:rPr>
-          <w:rFonts w:cs="Arial" w:ascii="Arial" w:hAnsi="Arial"/>
-          <w:sz w:val="20"/>
-          <w:szCs w:val="20"/>
-        </w:rPr>
-        <w:t>Piotr Staszko był odpowiedzialny za ...</w:t>
-      </w:r>
-    </w:p>
-    <w:p>
-      <w:pPr>
-        <w:pStyle w:val="Normal"/>
-        <w:spacing w:lineRule="auto" w:line="360" w:before="0" w:after="120"/>
-        <w:rPr>
-          <w:rFonts w:ascii="Arial" w:hAnsi="Arial" w:cs="Arial"/>
-          <w:b/>
-          <w:b/>
-          <w:sz w:val="20"/>
-          <w:szCs w:val="20"/>
-          <w:lang w:val="en-GB"/>
-        </w:rPr>
-      </w:pPr>
-      <w:r>
-        <w:rPr>
-          <w:rFonts w:cs="Arial" w:ascii="Arial" w:hAnsi="Arial"/>
-          <w:b/>
-          <w:sz w:val="20"/>
-          <w:szCs w:val="20"/>
-          <w:lang w:val="en-GB"/>
-        </w:rPr>
-        <w:t xml:space="preserve">Słowa kluczowe: </w:t>
-      </w:r>
-      <w:r>
-        <w:rPr>
-          <w:rFonts w:cs="Arial" w:ascii="Arial" w:hAnsi="Arial"/>
-          <w:b w:val="false"/>
-          <w:bCs w:val="false"/>
-          <w:sz w:val="20"/>
-          <w:szCs w:val="20"/>
           <w:lang w:val="en-GB"/>
         </w:rPr>
         <w:t>VR, unreal engine, unreal, gra, CAVE</w:t>
@@ -468,174 +408,270 @@
         </w:rPr>
       </w:pPr>
       <w:r>
-        <w:rPr/>
-      </w:r>
-    </w:p>
-    <w:p>
-      <w:pPr>
-        <w:pStyle w:val="Normal"/>
-        <w:spacing w:lineRule="auto" w:line="360" w:before="0" w:after="120"/>
-        <w:jc w:val="both"/>
-        <w:rPr>
-          <w:rFonts w:ascii="Arial" w:hAnsi="Arial" w:cs="Arial"/>
-          <w:sz w:val="20"/>
-          <w:szCs w:val="20"/>
-          <w:lang w:val="en-GB"/>
-        </w:rPr>
-      </w:pPr>
-      <w:r>
-        <w:rPr/>
-      </w:r>
-    </w:p>
-    <w:p>
-      <w:pPr>
-        <w:pStyle w:val="Normal"/>
-        <w:spacing w:lineRule="auto" w:line="360" w:before="0" w:after="120"/>
-        <w:jc w:val="both"/>
-        <w:rPr>
-          <w:rFonts w:ascii="Arial" w:hAnsi="Arial" w:cs="Arial"/>
-          <w:sz w:val="20"/>
-          <w:szCs w:val="20"/>
-          <w:lang w:val="en-GB"/>
-        </w:rPr>
-      </w:pPr>
-      <w:r>
-        <w:rPr/>
-      </w:r>
-    </w:p>
-    <w:p>
-      <w:pPr>
-        <w:pStyle w:val="Normal"/>
-        <w:spacing w:lineRule="auto" w:line="360" w:before="0" w:after="120"/>
-        <w:jc w:val="both"/>
-        <w:rPr>
-          <w:rFonts w:ascii="Arial" w:hAnsi="Arial" w:cs="Arial"/>
-          <w:sz w:val="20"/>
-          <w:szCs w:val="20"/>
-          <w:lang w:val="en-GB"/>
-        </w:rPr>
-      </w:pPr>
-      <w:r>
-        <w:rPr/>
-      </w:r>
-    </w:p>
-    <w:p>
-      <w:pPr>
-        <w:pStyle w:val="Normal"/>
-        <w:spacing w:lineRule="auto" w:line="360" w:before="0" w:after="120"/>
-        <w:jc w:val="both"/>
-        <w:rPr>
-          <w:rFonts w:ascii="Arial" w:hAnsi="Arial" w:cs="Arial"/>
-          <w:sz w:val="20"/>
-          <w:szCs w:val="20"/>
-          <w:lang w:val="en-GB"/>
-        </w:rPr>
-      </w:pPr>
-      <w:r>
-        <w:rPr/>
-      </w:r>
-    </w:p>
-    <w:p>
-      <w:pPr>
-        <w:pStyle w:val="Normal"/>
-        <w:spacing w:lineRule="auto" w:line="360" w:before="0" w:after="120"/>
-        <w:jc w:val="both"/>
-        <w:rPr>
-          <w:rFonts w:ascii="Arial" w:hAnsi="Arial" w:cs="Arial"/>
-          <w:sz w:val="20"/>
-          <w:szCs w:val="20"/>
-          <w:lang w:val="en-GB"/>
-        </w:rPr>
-      </w:pPr>
-      <w:r>
-        <w:rPr/>
-      </w:r>
-    </w:p>
-    <w:p>
-      <w:pPr>
-        <w:pStyle w:val="Normal"/>
-        <w:spacing w:lineRule="auto" w:line="360" w:before="0" w:after="120"/>
-        <w:jc w:val="both"/>
-        <w:rPr>
-          <w:rFonts w:ascii="Arial" w:hAnsi="Arial" w:cs="Arial"/>
-          <w:sz w:val="20"/>
-          <w:szCs w:val="20"/>
-          <w:lang w:val="en-GB"/>
-        </w:rPr>
-      </w:pPr>
-      <w:r>
-        <w:rPr/>
-      </w:r>
-    </w:p>
-    <w:p>
-      <w:pPr>
-        <w:pStyle w:val="Normal"/>
-        <w:spacing w:lineRule="auto" w:line="360" w:before="0" w:after="120"/>
-        <w:jc w:val="both"/>
-        <w:rPr>
-          <w:rFonts w:ascii="Arial" w:hAnsi="Arial" w:cs="Arial"/>
-          <w:sz w:val="20"/>
-          <w:szCs w:val="20"/>
-          <w:lang w:val="en-GB"/>
-        </w:rPr>
-      </w:pPr>
-      <w:r>
-        <w:rPr/>
-      </w:r>
-    </w:p>
-    <w:p>
-      <w:pPr>
-        <w:pStyle w:val="Normal"/>
-        <w:spacing w:lineRule="auto" w:line="360" w:before="0" w:after="120"/>
-        <w:jc w:val="both"/>
-        <w:rPr>
-          <w:rFonts w:ascii="Arial" w:hAnsi="Arial" w:cs="Arial"/>
-          <w:sz w:val="20"/>
-          <w:szCs w:val="20"/>
-          <w:lang w:val="en-GB"/>
-        </w:rPr>
-      </w:pPr>
-      <w:r>
-        <w:rPr/>
-      </w:r>
-    </w:p>
-    <w:p>
-      <w:pPr>
-        <w:pStyle w:val="Normal"/>
-        <w:spacing w:lineRule="auto" w:line="360" w:before="0" w:after="120"/>
-        <w:jc w:val="both"/>
-        <w:rPr>
-          <w:rFonts w:ascii="Arial" w:hAnsi="Arial" w:cs="Arial"/>
-          <w:sz w:val="20"/>
-          <w:szCs w:val="20"/>
-          <w:lang w:val="en-GB"/>
-        </w:rPr>
-      </w:pPr>
-      <w:r>
-        <w:rPr/>
-      </w:r>
-    </w:p>
-    <w:p>
-      <w:pPr>
-        <w:pStyle w:val="Normal"/>
-        <w:spacing w:lineRule="auto" w:line="360" w:before="0" w:after="120"/>
-        <w:jc w:val="both"/>
-        <w:rPr>
-          <w:rFonts w:ascii="Arial" w:hAnsi="Arial" w:cs="Arial"/>
-          <w:sz w:val="20"/>
-          <w:szCs w:val="20"/>
-          <w:lang w:val="en-GB"/>
-        </w:rPr>
-      </w:pPr>
-      <w:r>
-        <w:rPr/>
-      </w:r>
-    </w:p>
-    <w:p>
-      <w:pPr>
-        <w:pStyle w:val="Tytu"/>
-        <w:rPr>
-          <w:b w:val="false"/>
+        <w:rPr>
+          <w:rFonts w:cs="Arial" w:ascii="Arial" w:hAnsi="Arial"/>
+          <w:sz w:val="20"/>
+          <w:szCs w:val="20"/>
+          <w:lang w:val="en-GB"/>
+        </w:rPr>
+      </w:r>
+    </w:p>
+    <w:p>
+      <w:pPr>
+        <w:pStyle w:val="Normal"/>
+        <w:spacing w:lineRule="auto" w:line="360" w:before="0" w:after="120"/>
+        <w:jc w:val="both"/>
+        <w:rPr>
+          <w:rFonts w:ascii="Arial" w:hAnsi="Arial" w:cs="Arial"/>
+          <w:sz w:val="20"/>
+          <w:szCs w:val="20"/>
+          <w:lang w:val="en-GB"/>
+        </w:rPr>
+      </w:pPr>
+      <w:r>
+        <w:rPr>
+          <w:rFonts w:cs="Arial" w:ascii="Arial" w:hAnsi="Arial"/>
+          <w:sz w:val="20"/>
+          <w:szCs w:val="20"/>
+          <w:lang w:val="en-GB"/>
+        </w:rPr>
+      </w:r>
+    </w:p>
+    <w:p>
+      <w:pPr>
+        <w:pStyle w:val="Normal"/>
+        <w:spacing w:lineRule="auto" w:line="360" w:before="0" w:after="120"/>
+        <w:jc w:val="both"/>
+        <w:rPr>
+          <w:rFonts w:ascii="Arial" w:hAnsi="Arial" w:cs="Arial"/>
+          <w:sz w:val="20"/>
+          <w:szCs w:val="20"/>
+          <w:lang w:val="en-GB"/>
+        </w:rPr>
+      </w:pPr>
+      <w:r>
+        <w:rPr>
+          <w:rFonts w:cs="Arial" w:ascii="Arial" w:hAnsi="Arial"/>
+          <w:sz w:val="20"/>
+          <w:szCs w:val="20"/>
+          <w:lang w:val="en-GB"/>
+        </w:rPr>
+      </w:r>
+    </w:p>
+    <w:p>
+      <w:pPr>
+        <w:pStyle w:val="Normal"/>
+        <w:spacing w:lineRule="auto" w:line="360" w:before="0" w:after="120"/>
+        <w:jc w:val="both"/>
+        <w:rPr>
+          <w:rFonts w:ascii="Arial" w:hAnsi="Arial" w:cs="Arial"/>
+          <w:sz w:val="20"/>
+          <w:szCs w:val="20"/>
+          <w:lang w:val="en-GB"/>
+        </w:rPr>
+      </w:pPr>
+      <w:r>
+        <w:rPr>
+          <w:rFonts w:cs="Arial" w:ascii="Arial" w:hAnsi="Arial"/>
+          <w:sz w:val="20"/>
+          <w:szCs w:val="20"/>
+          <w:lang w:val="en-GB"/>
+        </w:rPr>
+      </w:r>
+    </w:p>
+    <w:p>
+      <w:pPr>
+        <w:pStyle w:val="Normal"/>
+        <w:spacing w:lineRule="auto" w:line="360" w:before="0" w:after="120"/>
+        <w:jc w:val="both"/>
+        <w:rPr>
+          <w:rFonts w:ascii="Arial" w:hAnsi="Arial" w:cs="Arial"/>
+          <w:sz w:val="20"/>
+          <w:szCs w:val="20"/>
+          <w:lang w:val="en-GB"/>
+        </w:rPr>
+      </w:pPr>
+      <w:r>
+        <w:rPr>
+          <w:rFonts w:cs="Arial" w:ascii="Arial" w:hAnsi="Arial"/>
+          <w:sz w:val="20"/>
+          <w:szCs w:val="20"/>
+          <w:lang w:val="en-GB"/>
+        </w:rPr>
+      </w:r>
+    </w:p>
+    <w:p>
+      <w:pPr>
+        <w:pStyle w:val="Normal"/>
+        <w:spacing w:lineRule="auto" w:line="360" w:before="0" w:after="120"/>
+        <w:jc w:val="both"/>
+        <w:rPr>
+          <w:rFonts w:ascii="Arial" w:hAnsi="Arial" w:cs="Arial"/>
+          <w:sz w:val="20"/>
+          <w:szCs w:val="20"/>
+          <w:lang w:val="en-GB"/>
+        </w:rPr>
+      </w:pPr>
+      <w:r>
+        <w:rPr>
+          <w:rFonts w:cs="Arial" w:ascii="Arial" w:hAnsi="Arial"/>
+          <w:sz w:val="20"/>
+          <w:szCs w:val="20"/>
+          <w:lang w:val="en-GB"/>
+        </w:rPr>
+      </w:r>
+    </w:p>
+    <w:p>
+      <w:pPr>
+        <w:pStyle w:val="Normal"/>
+        <w:spacing w:lineRule="auto" w:line="360" w:before="0" w:after="120"/>
+        <w:jc w:val="both"/>
+        <w:rPr>
+          <w:rFonts w:ascii="Arial" w:hAnsi="Arial" w:cs="Arial"/>
+          <w:sz w:val="20"/>
+          <w:szCs w:val="20"/>
+          <w:lang w:val="en-GB"/>
+        </w:rPr>
+      </w:pPr>
+      <w:r>
+        <w:rPr>
+          <w:rFonts w:cs="Arial" w:ascii="Arial" w:hAnsi="Arial"/>
+          <w:sz w:val="20"/>
+          <w:szCs w:val="20"/>
+          <w:lang w:val="en-GB"/>
+        </w:rPr>
+      </w:r>
+    </w:p>
+    <w:p>
+      <w:pPr>
+        <w:pStyle w:val="Normal"/>
+        <w:spacing w:lineRule="auto" w:line="360" w:before="0" w:after="120"/>
+        <w:jc w:val="both"/>
+        <w:rPr>
+          <w:rFonts w:ascii="Arial" w:hAnsi="Arial" w:cs="Arial"/>
+          <w:sz w:val="20"/>
+          <w:szCs w:val="20"/>
+          <w:lang w:val="en-GB"/>
+        </w:rPr>
+      </w:pPr>
+      <w:r>
+        <w:rPr>
+          <w:rFonts w:cs="Arial" w:ascii="Arial" w:hAnsi="Arial"/>
+          <w:sz w:val="20"/>
+          <w:szCs w:val="20"/>
+          <w:lang w:val="en-GB"/>
+        </w:rPr>
+      </w:r>
+    </w:p>
+    <w:p>
+      <w:pPr>
+        <w:pStyle w:val="Normal"/>
+        <w:spacing w:lineRule="auto" w:line="360" w:before="0" w:after="120"/>
+        <w:jc w:val="both"/>
+        <w:rPr>
+          <w:rFonts w:ascii="Arial" w:hAnsi="Arial" w:cs="Arial"/>
+          <w:sz w:val="20"/>
+          <w:szCs w:val="20"/>
+          <w:lang w:val="en-GB"/>
+        </w:rPr>
+      </w:pPr>
+      <w:r>
+        <w:rPr>
+          <w:rFonts w:cs="Arial" w:ascii="Arial" w:hAnsi="Arial"/>
+          <w:sz w:val="20"/>
+          <w:szCs w:val="20"/>
+          <w:lang w:val="en-GB"/>
+        </w:rPr>
+      </w:r>
+    </w:p>
+    <w:p>
+      <w:pPr>
+        <w:pStyle w:val="Normal"/>
+        <w:spacing w:lineRule="auto" w:line="360" w:before="0" w:after="120"/>
+        <w:jc w:val="both"/>
+        <w:rPr>
+          <w:rFonts w:ascii="Arial" w:hAnsi="Arial" w:cs="Arial"/>
+          <w:sz w:val="20"/>
+          <w:szCs w:val="20"/>
+          <w:lang w:val="en-GB"/>
+        </w:rPr>
+      </w:pPr>
+      <w:r>
+        <w:rPr>
+          <w:rFonts w:cs="Arial" w:ascii="Arial" w:hAnsi="Arial"/>
+          <w:sz w:val="20"/>
+          <w:szCs w:val="20"/>
+          <w:lang w:val="en-GB"/>
+        </w:rPr>
+      </w:r>
+    </w:p>
+    <w:p>
+      <w:pPr>
+        <w:pStyle w:val="Normal"/>
+        <w:spacing w:lineRule="auto" w:line="360" w:before="0" w:after="120"/>
+        <w:jc w:val="both"/>
+        <w:rPr>
+          <w:rFonts w:ascii="Arial" w:hAnsi="Arial" w:cs="Arial"/>
+          <w:sz w:val="20"/>
+          <w:szCs w:val="20"/>
+          <w:lang w:val="en-GB"/>
+        </w:rPr>
+      </w:pPr>
+      <w:r>
+        <w:rPr>
+          <w:rFonts w:cs="Arial" w:ascii="Arial" w:hAnsi="Arial"/>
+          <w:sz w:val="20"/>
+          <w:szCs w:val="20"/>
+          <w:lang w:val="en-GB"/>
+        </w:rPr>
+      </w:r>
+    </w:p>
+    <w:p>
+      <w:pPr>
+        <w:pStyle w:val="Normal"/>
+        <w:spacing w:lineRule="auto" w:line="360" w:before="0" w:after="120"/>
+        <w:jc w:val="both"/>
+        <w:rPr>
+          <w:rFonts w:ascii="Arial" w:hAnsi="Arial" w:cs="Arial"/>
+          <w:sz w:val="20"/>
+          <w:szCs w:val="20"/>
+          <w:lang w:val="en-GB"/>
+        </w:rPr>
+      </w:pPr>
+      <w:r>
+        <w:rPr>
+          <w:rFonts w:cs="Arial" w:ascii="Arial" w:hAnsi="Arial"/>
+          <w:sz w:val="20"/>
+          <w:szCs w:val="20"/>
+          <w:lang w:val="en-GB"/>
+        </w:rPr>
+      </w:r>
+    </w:p>
+    <w:p>
+      <w:pPr>
+        <w:pStyle w:val="Normal"/>
+        <w:spacing w:lineRule="auto" w:line="360" w:before="0" w:after="120"/>
+        <w:jc w:val="both"/>
+        <w:rPr>
+          <w:rFonts w:ascii="Arial" w:hAnsi="Arial" w:cs="Arial"/>
+          <w:sz w:val="20"/>
+          <w:szCs w:val="20"/>
+          <w:lang w:val="en-GB"/>
+        </w:rPr>
+      </w:pPr>
+      <w:r>
+        <w:rPr>
+          <w:rFonts w:cs="Arial" w:ascii="Arial" w:hAnsi="Arial"/>
+          <w:sz w:val="20"/>
+          <w:szCs w:val="20"/>
+          <w:lang w:val="en-GB"/>
+        </w:rPr>
+      </w:r>
+    </w:p>
+    <w:p>
+      <w:pPr>
+        <w:pStyle w:val="Title"/>
+        <w:rPr>
           <w:b w:val="false"/>
           <w:sz w:val="20"/>
           <w:lang w:val="en-GB"/>
@@ -648,23 +684,6 @@
           <w:b/>
         </w:rPr>
         <w:t xml:space="preserve">ABSTRACT </w:t>
-      </w:r>
-    </w:p>
-    <w:p>
-      <w:pPr>
-        <w:pStyle w:val="Normal"/>
-        <w:spacing w:lineRule="auto" w:line="360" w:before="0" w:after="120"/>
-        <w:ind w:firstLine="708"/>
-        <w:jc w:val="both"/>
-        <w:rPr>
-          <w:rFonts w:ascii="Arial" w:hAnsi="Arial" w:cs="Arial"/>
-          <w:sz w:val="20"/>
-          <w:szCs w:val="20"/>
-          <w:lang w:val="en-GB"/>
-        </w:rPr>
-      </w:pPr>
-      <w:r>
-        <w:rPr/>
       </w:r>
     </w:p>
     <w:p>
@@ -693,12 +712,17 @@
         </w:rPr>
       </w:pPr>
       <w:r>
-        <w:rPr/>
-      </w:r>
-    </w:p>
-    <w:p>
-      <w:pPr>
-        <w:pStyle w:val="Nagwekspisutreci"/>
+        <w:rPr>
+          <w:rFonts w:cs="Arial" w:ascii="Arial" w:hAnsi="Arial"/>
+          <w:sz w:val="20"/>
+          <w:szCs w:val="20"/>
+          <w:lang w:val="en-GB"/>
+        </w:rPr>
+      </w:r>
+    </w:p>
+    <w:p>
+      <w:pPr>
+        <w:pStyle w:val="TOCHeading"/>
         <w:rPr/>
       </w:pPr>
       <w:r>
@@ -716,7 +740,7 @@
       <w:sdtContent>
         <w:p>
           <w:pPr>
-            <w:pStyle w:val="Spistreci1"/>
+            <w:pStyle w:val="TOC1"/>
             <w:tabs>
               <w:tab w:val="clear" w:pos="426"/>
               <w:tab w:val="clear" w:pos="9060"/>
@@ -751,6 +775,12 @@
                 <w:vanish w:val="false"/>
               </w:rPr>
               <w:t>WYKAZ WAŻNIEJSZYCH OZNACZEŃ I SKRÓTÓW</w:t>
+            </w:r>
+            <w:r>
+              <w:rPr>
+                <w:rStyle w:val="Czeindeksu"/>
+                <w:vanish w:val="false"/>
+              </w:rPr>
               <w:tab/>
               <w:t>6</w:t>
             </w:r>
@@ -758,7 +788,7 @@
         </w:p>
         <w:p>
           <w:pPr>
-            <w:pStyle w:val="Spistreci1"/>
+            <w:pStyle w:val="TOC1"/>
             <w:tabs>
               <w:tab w:val="clear" w:pos="426"/>
               <w:tab w:val="clear" w:pos="9060"/>
@@ -781,7 +811,7 @@
         </w:p>
         <w:p>
           <w:pPr>
-            <w:pStyle w:val="Spistreci1"/>
+            <w:pStyle w:val="TOC1"/>
             <w:tabs>
               <w:tab w:val="clear" w:pos="426"/>
               <w:tab w:val="clear" w:pos="9060"/>
@@ -804,7 +834,7 @@
         </w:p>
         <w:p>
           <w:pPr>
-            <w:pStyle w:val="Spistreci2"/>
+            <w:pStyle w:val="TOC2"/>
             <w:tabs>
               <w:tab w:val="clear" w:pos="993"/>
               <w:tab w:val="clear" w:pos="9060"/>
@@ -827,7 +857,7 @@
         </w:p>
         <w:p>
           <w:pPr>
-            <w:pStyle w:val="Spistreci2"/>
+            <w:pStyle w:val="TOC2"/>
             <w:tabs>
               <w:tab w:val="clear" w:pos="993"/>
               <w:tab w:val="clear" w:pos="9060"/>
@@ -850,7 +880,7 @@
         </w:p>
         <w:p>
           <w:pPr>
-            <w:pStyle w:val="Spistreci1"/>
+            <w:pStyle w:val="TOC1"/>
             <w:tabs>
               <w:tab w:val="clear" w:pos="426"/>
               <w:tab w:val="clear" w:pos="9060"/>
@@ -873,7 +903,7 @@
         </w:p>
         <w:p>
           <w:pPr>
-            <w:pStyle w:val="Spistreci2"/>
+            <w:pStyle w:val="TOC2"/>
             <w:tabs>
               <w:tab w:val="clear" w:pos="993"/>
               <w:tab w:val="clear" w:pos="9060"/>
@@ -896,7 +926,7 @@
         </w:p>
         <w:p>
           <w:pPr>
-            <w:pStyle w:val="Spistreci2"/>
+            <w:pStyle w:val="TOC2"/>
             <w:tabs>
               <w:tab w:val="clear" w:pos="993"/>
               <w:tab w:val="clear" w:pos="9060"/>
@@ -919,7 +949,7 @@
         </w:p>
         <w:p>
           <w:pPr>
-            <w:pStyle w:val="Spistreci1"/>
+            <w:pStyle w:val="TOC1"/>
             <w:tabs>
               <w:tab w:val="clear" w:pos="426"/>
               <w:tab w:val="clear" w:pos="9060"/>
@@ -942,7 +972,7 @@
         </w:p>
         <w:p>
           <w:pPr>
-            <w:pStyle w:val="Spistreci2"/>
+            <w:pStyle w:val="TOC2"/>
             <w:tabs>
               <w:tab w:val="clear" w:pos="993"/>
               <w:tab w:val="clear" w:pos="9060"/>
@@ -965,7 +995,7 @@
         </w:p>
         <w:p>
           <w:pPr>
-            <w:pStyle w:val="Spistreci3"/>
+            <w:pStyle w:val="TOC3"/>
             <w:tabs>
               <w:tab w:val="clear" w:pos="1701"/>
               <w:tab w:val="clear" w:pos="9060"/>
@@ -988,7 +1018,7 @@
         </w:p>
         <w:p>
           <w:pPr>
-            <w:pStyle w:val="Spistreci3"/>
+            <w:pStyle w:val="TOC3"/>
             <w:tabs>
               <w:tab w:val="clear" w:pos="1701"/>
               <w:tab w:val="clear" w:pos="9060"/>
@@ -1011,7 +1041,7 @@
         </w:p>
         <w:p>
           <w:pPr>
-            <w:pStyle w:val="Spistreci3"/>
+            <w:pStyle w:val="TOC3"/>
             <w:tabs>
               <w:tab w:val="clear" w:pos="1701"/>
               <w:tab w:val="clear" w:pos="9060"/>
@@ -1034,7 +1064,7 @@
         </w:p>
         <w:p>
           <w:pPr>
-            <w:pStyle w:val="Spistreci2"/>
+            <w:pStyle w:val="TOC2"/>
             <w:tabs>
               <w:tab w:val="clear" w:pos="993"/>
               <w:tab w:val="clear" w:pos="9060"/>
@@ -1057,7 +1087,7 @@
         </w:p>
         <w:p>
           <w:pPr>
-            <w:pStyle w:val="Spistreci2"/>
+            <w:pStyle w:val="TOC2"/>
             <w:tabs>
               <w:tab w:val="clear" w:pos="993"/>
               <w:tab w:val="clear" w:pos="9060"/>
@@ -1080,7 +1110,7 @@
         </w:p>
         <w:p>
           <w:pPr>
-            <w:pStyle w:val="Spistreci2"/>
+            <w:pStyle w:val="TOC2"/>
             <w:tabs>
               <w:tab w:val="clear" w:pos="993"/>
               <w:tab w:val="clear" w:pos="9060"/>
@@ -1103,7 +1133,7 @@
         </w:p>
         <w:p>
           <w:pPr>
-            <w:pStyle w:val="Spistreci2"/>
+            <w:pStyle w:val="TOC2"/>
             <w:tabs>
               <w:tab w:val="clear" w:pos="993"/>
               <w:tab w:val="clear" w:pos="9060"/>
@@ -1126,7 +1156,7 @@
         </w:p>
         <w:p>
           <w:pPr>
-            <w:pStyle w:val="Spistreci2"/>
+            <w:pStyle w:val="TOC2"/>
             <w:tabs>
               <w:tab w:val="clear" w:pos="993"/>
               <w:tab w:val="clear" w:pos="9060"/>
@@ -1149,7 +1179,7 @@
         </w:p>
         <w:p>
           <w:pPr>
-            <w:pStyle w:val="Spistreci2"/>
+            <w:pStyle w:val="TOC2"/>
             <w:tabs>
               <w:tab w:val="clear" w:pos="993"/>
               <w:tab w:val="clear" w:pos="9060"/>
@@ -1172,7 +1202,7 @@
         </w:p>
         <w:p>
           <w:pPr>
-            <w:pStyle w:val="Spistreci2"/>
+            <w:pStyle w:val="TOC2"/>
             <w:tabs>
               <w:tab w:val="clear" w:pos="993"/>
               <w:tab w:val="clear" w:pos="9060"/>
@@ -1195,7 +1225,7 @@
         </w:p>
         <w:p>
           <w:pPr>
-            <w:pStyle w:val="Spistreci3"/>
+            <w:pStyle w:val="TOC3"/>
             <w:tabs>
               <w:tab w:val="clear" w:pos="1701"/>
               <w:tab w:val="clear" w:pos="9060"/>
@@ -1218,7 +1248,7 @@
         </w:p>
         <w:p>
           <w:pPr>
-            <w:pStyle w:val="Spistreci2"/>
+            <w:pStyle w:val="TOC2"/>
             <w:tabs>
               <w:tab w:val="clear" w:pos="993"/>
               <w:tab w:val="clear" w:pos="9060"/>
@@ -1241,7 +1271,7 @@
         </w:p>
         <w:p>
           <w:pPr>
-            <w:pStyle w:val="Spistreci1"/>
+            <w:pStyle w:val="TOC1"/>
             <w:tabs>
               <w:tab w:val="clear" w:pos="426"/>
               <w:tab w:val="clear" w:pos="9060"/>
@@ -1264,7 +1294,7 @@
         </w:p>
         <w:p>
           <w:pPr>
-            <w:pStyle w:val="Spistreci2"/>
+            <w:pStyle w:val="TOC2"/>
             <w:tabs>
               <w:tab w:val="clear" w:pos="993"/>
               <w:tab w:val="clear" w:pos="9060"/>
@@ -1287,7 +1317,7 @@
         </w:p>
         <w:p>
           <w:pPr>
-            <w:pStyle w:val="Spistreci2"/>
+            <w:pStyle w:val="TOC2"/>
             <w:tabs>
               <w:tab w:val="clear" w:pos="993"/>
               <w:tab w:val="clear" w:pos="9060"/>
@@ -1310,7 +1340,7 @@
         </w:p>
         <w:p>
           <w:pPr>
-            <w:pStyle w:val="Spistreci2"/>
+            <w:pStyle w:val="TOC2"/>
             <w:tabs>
               <w:tab w:val="clear" w:pos="993"/>
               <w:tab w:val="clear" w:pos="9060"/>
@@ -1333,7 +1363,7 @@
         </w:p>
         <w:p>
           <w:pPr>
-            <w:pStyle w:val="Spistreci1"/>
+            <w:pStyle w:val="TOC1"/>
             <w:tabs>
               <w:tab w:val="clear" w:pos="426"/>
               <w:tab w:val="clear" w:pos="9060"/>
@@ -1356,7 +1386,7 @@
         </w:p>
         <w:p>
           <w:pPr>
-            <w:pStyle w:val="Spistreci2"/>
+            <w:pStyle w:val="TOC2"/>
             <w:tabs>
               <w:tab w:val="clear" w:pos="993"/>
               <w:tab w:val="clear" w:pos="9060"/>
@@ -1379,7 +1409,7 @@
         </w:p>
         <w:p>
           <w:pPr>
-            <w:pStyle w:val="Spistreci2"/>
+            <w:pStyle w:val="TOC2"/>
             <w:tabs>
               <w:tab w:val="clear" w:pos="993"/>
               <w:tab w:val="clear" w:pos="9060"/>
@@ -1402,7 +1432,7 @@
         </w:p>
         <w:p>
           <w:pPr>
-            <w:pStyle w:val="Spistreci2"/>
+            <w:pStyle w:val="TOC2"/>
             <w:tabs>
               <w:tab w:val="clear" w:pos="993"/>
               <w:tab w:val="clear" w:pos="9060"/>
@@ -1425,7 +1455,7 @@
         </w:p>
         <w:p>
           <w:pPr>
-            <w:pStyle w:val="Spistreci2"/>
+            <w:pStyle w:val="TOC2"/>
             <w:tabs>
               <w:tab w:val="clear" w:pos="993"/>
               <w:tab w:val="clear" w:pos="9060"/>
@@ -1448,7 +1478,7 @@
         </w:p>
         <w:p>
           <w:pPr>
-            <w:pStyle w:val="Spistreci1"/>
+            <w:pStyle w:val="TOC1"/>
             <w:tabs>
               <w:tab w:val="clear" w:pos="426"/>
               <w:tab w:val="clear" w:pos="9060"/>
@@ -1471,7 +1501,7 @@
         </w:p>
         <w:p>
           <w:pPr>
-            <w:pStyle w:val="Spistreci2"/>
+            <w:pStyle w:val="TOC2"/>
             <w:tabs>
               <w:tab w:val="clear" w:pos="993"/>
               <w:tab w:val="clear" w:pos="9060"/>
@@ -1494,7 +1524,7 @@
         </w:p>
         <w:p>
           <w:pPr>
-            <w:pStyle w:val="Spistreci2"/>
+            <w:pStyle w:val="TOC2"/>
             <w:tabs>
               <w:tab w:val="clear" w:pos="993"/>
               <w:tab w:val="clear" w:pos="9060"/>
@@ -1517,7 +1547,7 @@
         </w:p>
         <w:p>
           <w:pPr>
-            <w:pStyle w:val="Spistreci1"/>
+            <w:pStyle w:val="TOC1"/>
             <w:tabs>
               <w:tab w:val="clear" w:pos="426"/>
               <w:tab w:val="clear" w:pos="9060"/>
@@ -1540,7 +1570,7 @@
         </w:p>
         <w:p>
           <w:pPr>
-            <w:pStyle w:val="Spistreci1"/>
+            <w:pStyle w:val="TOC1"/>
             <w:tabs>
               <w:tab w:val="clear" w:pos="426"/>
               <w:tab w:val="clear" w:pos="9060"/>
@@ -1563,7 +1593,7 @@
         </w:p>
         <w:p>
           <w:pPr>
-            <w:pStyle w:val="Spistreci1"/>
+            <w:pStyle w:val="TOC1"/>
             <w:tabs>
               <w:tab w:val="clear" w:pos="426"/>
               <w:tab w:val="clear" w:pos="9060"/>
@@ -1622,16 +1652,16 @@
     </w:sdt>
     <w:p>
       <w:pPr>
-        <w:pStyle w:val="Nagwek1"/>
+        <w:pStyle w:val="Heading1"/>
         <w:rPr>
           <w:lang w:val="pl-PL"/>
         </w:rPr>
       </w:pPr>
       <w:bookmarkStart w:id="1" w:name="__RefHeading___Toc617_343945465"/>
-      <w:bookmarkStart w:id="2" w:name="_Toc518373993"/>
-      <w:bookmarkStart w:id="3" w:name="_Toc518369837"/>
-      <w:bookmarkStart w:id="4" w:name="_Toc516650486"/>
-      <w:bookmarkStart w:id="5" w:name="_Toc516556278"/>
+      <w:bookmarkStart w:id="2" w:name="_Toc516556278"/>
+      <w:bookmarkStart w:id="3" w:name="_Toc516650486"/>
+      <w:bookmarkStart w:id="4" w:name="_Toc518369837"/>
+      <w:bookmarkStart w:id="5" w:name="_Toc518373993"/>
       <w:bookmarkEnd w:id="1"/>
       <w:r>
         <w:rPr>
@@ -1669,18 +1699,7 @@
           <w:szCs w:val="20"/>
           <w:lang w:val="en-GB"/>
         </w:rPr>
-        <w:t>VR (</w:t>
-      </w:r>
-      <w:r>
-        <w:rPr>
-          <w:rFonts w:cs="Arial" w:ascii="Arial" w:hAnsi="Arial"/>
-          <w:i w:val="false"/>
-          <w:iCs w:val="false"/>
-          <w:sz w:val="20"/>
-          <w:szCs w:val="20"/>
-          <w:lang w:val="en-GB"/>
-        </w:rPr>
-        <w:t xml:space="preserve">ang. </w:t>
+        <w:t xml:space="preserve">VR (ang. </w:t>
       </w:r>
       <w:r>
         <w:rPr>
@@ -1730,18 +1749,7 @@
           <w:szCs w:val="20"/>
           <w:lang w:val="en-GB"/>
         </w:rPr>
-        <w:t>CAVE (</w:t>
-      </w:r>
-      <w:r>
-        <w:rPr>
-          <w:rFonts w:cs="Arial" w:ascii="Arial" w:hAnsi="Arial"/>
-          <w:i w:val="false"/>
-          <w:iCs w:val="false"/>
-          <w:sz w:val="20"/>
-          <w:szCs w:val="20"/>
-          <w:lang w:val="en-GB"/>
-        </w:rPr>
-        <w:t>ang.</w:t>
+        <w:t>CAVE (ang.</w:t>
       </w:r>
       <w:r>
         <w:rPr>
@@ -1752,18 +1760,7 @@
           <w:szCs w:val="20"/>
           <w:lang w:val="en-GB"/>
         </w:rPr>
-        <w:t xml:space="preserve"> </w:t>
-      </w:r>
-      <w:r>
-        <w:rPr>
-          <w:rFonts w:cs="Arial" w:ascii="Arial" w:hAnsi="Arial"/>
-          <w:i/>
-          <w:iCs/>
-          <w:sz w:val="20"/>
-          <w:szCs w:val="20"/>
-          <w:lang w:val="en-GB"/>
-        </w:rPr>
-        <w:t>cave automatic virtual environment</w:t>
+        <w:t xml:space="preserve"> cave automatic virtual environment</w:t>
       </w:r>
       <w:r>
         <w:rPr>
@@ -1871,7 +1868,12 @@
         </w:rPr>
       </w:pPr>
       <w:r>
-        <w:rPr/>
+        <w:rPr>
+          <w:rFonts w:cs="Arial" w:ascii="Arial" w:hAnsi="Arial"/>
+          <w:sz w:val="20"/>
+          <w:szCs w:val="20"/>
+          <w:lang w:val="en-GB"/>
+        </w:rPr>
       </w:r>
     </w:p>
     <w:p>
@@ -1891,7 +1893,12 @@
         </w:rPr>
       </w:pPr>
       <w:r>
-        <w:rPr/>
+        <w:rPr>
+          <w:rFonts w:cs="Arial" w:ascii="Arial" w:hAnsi="Arial"/>
+          <w:sz w:val="20"/>
+          <w:szCs w:val="20"/>
+          <w:lang w:val="en-GB"/>
+        </w:rPr>
       </w:r>
     </w:p>
     <w:p>
@@ -1911,7 +1918,12 @@
         </w:rPr>
       </w:pPr>
       <w:r>
-        <w:rPr/>
+        <w:rPr>
+          <w:rFonts w:cs="Arial" w:ascii="Arial" w:hAnsi="Arial"/>
+          <w:sz w:val="20"/>
+          <w:szCs w:val="20"/>
+          <w:lang w:val="en-GB"/>
+        </w:rPr>
       </w:r>
     </w:p>
     <w:p>
@@ -1931,7 +1943,12 @@
         </w:rPr>
       </w:pPr>
       <w:r>
-        <w:rPr/>
+        <w:rPr>
+          <w:rFonts w:cs="Arial" w:ascii="Arial" w:hAnsi="Arial"/>
+          <w:sz w:val="20"/>
+          <w:szCs w:val="20"/>
+          <w:lang w:val="en-GB"/>
+        </w:rPr>
       </w:r>
     </w:p>
     <w:p>
@@ -1951,7 +1968,12 @@
         </w:rPr>
       </w:pPr>
       <w:r>
-        <w:rPr/>
+        <w:rPr>
+          <w:rFonts w:cs="Arial" w:ascii="Arial" w:hAnsi="Arial"/>
+          <w:sz w:val="20"/>
+          <w:szCs w:val="20"/>
+          <w:lang w:val="en-GB"/>
+        </w:rPr>
       </w:r>
     </w:p>
     <w:p>
@@ -1971,7 +1993,12 @@
         </w:rPr>
       </w:pPr>
       <w:r>
-        <w:rPr/>
+        <w:rPr>
+          <w:rFonts w:cs="Arial" w:ascii="Arial" w:hAnsi="Arial"/>
+          <w:sz w:val="20"/>
+          <w:szCs w:val="20"/>
+          <w:lang w:val="en-GB"/>
+        </w:rPr>
       </w:r>
     </w:p>
     <w:p>
@@ -1991,7 +2018,12 @@
         </w:rPr>
       </w:pPr>
       <w:r>
-        <w:rPr/>
+        <w:rPr>
+          <w:rFonts w:cs="Arial" w:ascii="Arial" w:hAnsi="Arial"/>
+          <w:sz w:val="20"/>
+          <w:szCs w:val="20"/>
+          <w:lang w:val="en-GB"/>
+        </w:rPr>
       </w:r>
     </w:p>
     <w:p>
@@ -2011,7 +2043,12 @@
         </w:rPr>
       </w:pPr>
       <w:r>
-        <w:rPr/>
+        <w:rPr>
+          <w:rFonts w:cs="Arial" w:ascii="Arial" w:hAnsi="Arial"/>
+          <w:sz w:val="20"/>
+          <w:szCs w:val="20"/>
+          <w:lang w:val="en-GB"/>
+        </w:rPr>
       </w:r>
     </w:p>
     <w:p>
@@ -2031,7 +2068,12 @@
         </w:rPr>
       </w:pPr>
       <w:r>
-        <w:rPr/>
+        <w:rPr>
+          <w:rFonts w:cs="Arial" w:ascii="Arial" w:hAnsi="Arial"/>
+          <w:sz w:val="20"/>
+          <w:szCs w:val="20"/>
+          <w:lang w:val="en-GB"/>
+        </w:rPr>
       </w:r>
     </w:p>
     <w:p>
@@ -2051,7 +2093,12 @@
         </w:rPr>
       </w:pPr>
       <w:r>
-        <w:rPr/>
+        <w:rPr>
+          <w:rFonts w:cs="Arial" w:ascii="Arial" w:hAnsi="Arial"/>
+          <w:sz w:val="20"/>
+          <w:szCs w:val="20"/>
+          <w:lang w:val="en-GB"/>
+        </w:rPr>
       </w:r>
     </w:p>
     <w:p>
@@ -2071,7 +2118,12 @@
         </w:rPr>
       </w:pPr>
       <w:r>
-        <w:rPr/>
+        <w:rPr>
+          <w:rFonts w:cs="Arial" w:ascii="Arial" w:hAnsi="Arial"/>
+          <w:sz w:val="20"/>
+          <w:szCs w:val="20"/>
+          <w:lang w:val="en-GB"/>
+        </w:rPr>
       </w:r>
     </w:p>
     <w:p>
@@ -2091,7 +2143,12 @@
         </w:rPr>
       </w:pPr>
       <w:r>
-        <w:rPr/>
+        <w:rPr>
+          <w:rFonts w:cs="Arial" w:ascii="Arial" w:hAnsi="Arial"/>
+          <w:sz w:val="20"/>
+          <w:szCs w:val="20"/>
+          <w:lang w:val="en-GB"/>
+        </w:rPr>
       </w:r>
     </w:p>
     <w:p>
@@ -2111,7 +2168,12 @@
         </w:rPr>
       </w:pPr>
       <w:r>
-        <w:rPr/>
+        <w:rPr>
+          <w:rFonts w:cs="Arial" w:ascii="Arial" w:hAnsi="Arial"/>
+          <w:sz w:val="20"/>
+          <w:szCs w:val="20"/>
+          <w:lang w:val="en-GB"/>
+        </w:rPr>
       </w:r>
     </w:p>
     <w:p>
@@ -2131,7 +2193,12 @@
         </w:rPr>
       </w:pPr>
       <w:r>
-        <w:rPr/>
+        <w:rPr>
+          <w:rFonts w:cs="Arial" w:ascii="Arial" w:hAnsi="Arial"/>
+          <w:sz w:val="20"/>
+          <w:szCs w:val="20"/>
+          <w:lang w:val="en-GB"/>
+        </w:rPr>
       </w:r>
     </w:p>
     <w:p>
@@ -2151,7 +2218,12 @@
         </w:rPr>
       </w:pPr>
       <w:r>
-        <w:rPr/>
+        <w:rPr>
+          <w:rFonts w:cs="Arial" w:ascii="Arial" w:hAnsi="Arial"/>
+          <w:sz w:val="20"/>
+          <w:szCs w:val="20"/>
+          <w:lang w:val="en-GB"/>
+        </w:rPr>
       </w:r>
     </w:p>
     <w:p>
@@ -2171,7 +2243,12 @@
         </w:rPr>
       </w:pPr>
       <w:r>
-        <w:rPr/>
+        <w:rPr>
+          <w:rFonts w:cs="Arial" w:ascii="Arial" w:hAnsi="Arial"/>
+          <w:sz w:val="20"/>
+          <w:szCs w:val="20"/>
+          <w:lang w:val="en-GB"/>
+        </w:rPr>
       </w:r>
     </w:p>
     <w:p>
@@ -2191,7 +2268,12 @@
         </w:rPr>
       </w:pPr>
       <w:r>
-        <w:rPr/>
+        <w:rPr>
+          <w:rFonts w:cs="Arial" w:ascii="Arial" w:hAnsi="Arial"/>
+          <w:sz w:val="20"/>
+          <w:szCs w:val="20"/>
+          <w:lang w:val="en-GB"/>
+        </w:rPr>
       </w:r>
     </w:p>
     <w:p>
@@ -2211,7 +2293,12 @@
         </w:rPr>
       </w:pPr>
       <w:r>
-        <w:rPr/>
+        <w:rPr>
+          <w:rFonts w:cs="Arial" w:ascii="Arial" w:hAnsi="Arial"/>
+          <w:sz w:val="20"/>
+          <w:szCs w:val="20"/>
+          <w:lang w:val="en-GB"/>
+        </w:rPr>
       </w:r>
     </w:p>
     <w:p>
@@ -2231,7 +2318,12 @@
         </w:rPr>
       </w:pPr>
       <w:r>
-        <w:rPr/>
+        <w:rPr>
+          <w:rFonts w:cs="Arial" w:ascii="Arial" w:hAnsi="Arial"/>
+          <w:sz w:val="20"/>
+          <w:szCs w:val="20"/>
+          <w:lang w:val="en-GB"/>
+        </w:rPr>
       </w:r>
     </w:p>
     <w:p>
@@ -2251,7 +2343,12 @@
         </w:rPr>
       </w:pPr>
       <w:r>
-        <w:rPr/>
+        <w:rPr>
+          <w:rFonts w:cs="Arial" w:ascii="Arial" w:hAnsi="Arial"/>
+          <w:sz w:val="20"/>
+          <w:szCs w:val="20"/>
+          <w:lang w:val="en-GB"/>
+        </w:rPr>
       </w:r>
     </w:p>
     <w:p>
@@ -2271,7 +2368,12 @@
         </w:rPr>
       </w:pPr>
       <w:r>
-        <w:rPr/>
+        <w:rPr>
+          <w:rFonts w:cs="Arial" w:ascii="Arial" w:hAnsi="Arial"/>
+          <w:sz w:val="20"/>
+          <w:szCs w:val="20"/>
+          <w:lang w:val="en-GB"/>
+        </w:rPr>
       </w:r>
     </w:p>
     <w:p>
@@ -2291,7 +2393,12 @@
         </w:rPr>
       </w:pPr>
       <w:r>
-        <w:rPr/>
+        <w:rPr>
+          <w:rFonts w:cs="Arial" w:ascii="Arial" w:hAnsi="Arial"/>
+          <w:sz w:val="20"/>
+          <w:szCs w:val="20"/>
+          <w:lang w:val="en-GB"/>
+        </w:rPr>
       </w:r>
     </w:p>
     <w:p>
@@ -2311,7 +2418,12 @@
         </w:rPr>
       </w:pPr>
       <w:r>
-        <w:rPr/>
+        <w:rPr>
+          <w:rFonts w:cs="Arial" w:ascii="Arial" w:hAnsi="Arial"/>
+          <w:sz w:val="20"/>
+          <w:szCs w:val="20"/>
+          <w:lang w:val="en-GB"/>
+        </w:rPr>
       </w:r>
     </w:p>
     <w:p>
@@ -2331,7 +2443,12 @@
         </w:rPr>
       </w:pPr>
       <w:r>
-        <w:rPr/>
+        <w:rPr>
+          <w:rFonts w:cs="Arial" w:ascii="Arial" w:hAnsi="Arial"/>
+          <w:sz w:val="20"/>
+          <w:szCs w:val="20"/>
+          <w:lang w:val="en-GB"/>
+        </w:rPr>
       </w:r>
     </w:p>
     <w:p>
@@ -2351,26 +2468,156 @@
         </w:rPr>
       </w:pPr>
       <w:r>
-        <w:rPr/>
-      </w:r>
-    </w:p>
-    <w:p>
-      <w:pPr>
-        <w:pStyle w:val="Nagwek1"/>
+        <w:rPr>
+          <w:rFonts w:cs="Arial" w:ascii="Arial" w:hAnsi="Arial"/>
+          <w:sz w:val="20"/>
+          <w:szCs w:val="20"/>
+          <w:lang w:val="en-GB"/>
+        </w:rPr>
+      </w:r>
+    </w:p>
+    <w:p>
+      <w:pPr>
+        <w:pStyle w:val="Normal"/>
+        <w:tabs>
+          <w:tab w:val="clear" w:pos="708"/>
+          <w:tab w:val="left" w:pos="426" w:leader="none"/>
+          <w:tab w:val="left" w:pos="709" w:leader="none"/>
+        </w:tabs>
+        <w:spacing w:lineRule="auto" w:line="360"/>
+        <w:rPr>
+          <w:rFonts w:ascii="Arial" w:hAnsi="Arial" w:cs="Arial"/>
+          <w:sz w:val="20"/>
+          <w:szCs w:val="20"/>
+          <w:lang w:val="en-GB"/>
+        </w:rPr>
+      </w:pPr>
+      <w:r>
+        <w:rPr>
+          <w:rFonts w:cs="Arial" w:ascii="Arial" w:hAnsi="Arial"/>
+          <w:sz w:val="20"/>
+          <w:szCs w:val="20"/>
+          <w:lang w:val="en-GB"/>
+        </w:rPr>
+      </w:r>
+    </w:p>
+    <w:p>
+      <w:pPr>
+        <w:pStyle w:val="Normal"/>
+        <w:tabs>
+          <w:tab w:val="clear" w:pos="708"/>
+          <w:tab w:val="left" w:pos="426" w:leader="none"/>
+          <w:tab w:val="left" w:pos="709" w:leader="none"/>
+        </w:tabs>
+        <w:spacing w:lineRule="auto" w:line="360"/>
+        <w:rPr>
+          <w:rFonts w:ascii="Arial" w:hAnsi="Arial" w:cs="Arial"/>
+          <w:sz w:val="20"/>
+          <w:szCs w:val="20"/>
+          <w:lang w:val="en-GB"/>
+        </w:rPr>
+      </w:pPr>
+      <w:r>
+        <w:rPr>
+          <w:rFonts w:cs="Arial" w:ascii="Arial" w:hAnsi="Arial"/>
+          <w:sz w:val="20"/>
+          <w:szCs w:val="20"/>
+          <w:lang w:val="en-GB"/>
+        </w:rPr>
+      </w:r>
+    </w:p>
+    <w:p>
+      <w:pPr>
+        <w:pStyle w:val="Normal"/>
+        <w:tabs>
+          <w:tab w:val="clear" w:pos="708"/>
+          <w:tab w:val="left" w:pos="426" w:leader="none"/>
+          <w:tab w:val="left" w:pos="709" w:leader="none"/>
+        </w:tabs>
+        <w:spacing w:lineRule="auto" w:line="360"/>
+        <w:rPr>
+          <w:rFonts w:ascii="Arial" w:hAnsi="Arial" w:cs="Arial"/>
+          <w:sz w:val="20"/>
+          <w:szCs w:val="20"/>
+          <w:lang w:val="en-GB"/>
+        </w:rPr>
+      </w:pPr>
+      <w:r>
+        <w:rPr>
+          <w:rFonts w:cs="Arial" w:ascii="Arial" w:hAnsi="Arial"/>
+          <w:sz w:val="20"/>
+          <w:szCs w:val="20"/>
+          <w:lang w:val="en-GB"/>
+        </w:rPr>
+      </w:r>
+    </w:p>
+    <w:p>
+      <w:pPr>
+        <w:pStyle w:val="Normal"/>
+        <w:tabs>
+          <w:tab w:val="clear" w:pos="708"/>
+          <w:tab w:val="left" w:pos="426" w:leader="none"/>
+          <w:tab w:val="left" w:pos="709" w:leader="none"/>
+        </w:tabs>
+        <w:spacing w:lineRule="auto" w:line="360"/>
+        <w:rPr>
+          <w:rFonts w:ascii="Arial" w:hAnsi="Arial" w:cs="Arial"/>
+          <w:sz w:val="20"/>
+          <w:szCs w:val="20"/>
+          <w:lang w:val="en-GB"/>
+        </w:rPr>
+      </w:pPr>
+      <w:r>
+        <w:rPr>
+          <w:rFonts w:cs="Arial" w:ascii="Arial" w:hAnsi="Arial"/>
+          <w:sz w:val="20"/>
+          <w:szCs w:val="20"/>
+          <w:lang w:val="en-GB"/>
+        </w:rPr>
+      </w:r>
+    </w:p>
+    <w:p>
+      <w:pPr>
+        <w:pStyle w:val="Normal"/>
+        <w:tabs>
+          <w:tab w:val="clear" w:pos="708"/>
+          <w:tab w:val="left" w:pos="426" w:leader="none"/>
+          <w:tab w:val="left" w:pos="709" w:leader="none"/>
+        </w:tabs>
+        <w:spacing w:lineRule="auto" w:line="360"/>
+        <w:rPr>
+          <w:rFonts w:ascii="Arial" w:hAnsi="Arial" w:cs="Arial"/>
+          <w:sz w:val="20"/>
+          <w:szCs w:val="20"/>
+          <w:lang w:val="en-GB"/>
+        </w:rPr>
+      </w:pPr>
+      <w:r>
+        <w:rPr>
+          <w:rFonts w:cs="Arial" w:ascii="Arial" w:hAnsi="Arial"/>
+          <w:sz w:val="20"/>
+          <w:szCs w:val="20"/>
+          <w:lang w:val="en-GB"/>
+        </w:rPr>
+      </w:r>
+    </w:p>
+    <w:p>
+      <w:pPr>
+        <w:pStyle w:val="Heading1"/>
         <w:numPr>
           <w:ilvl w:val="0"/>
           <w:numId w:val="1"/>
         </w:numPr>
-        <w:ind w:left="426" w:hanging="426"/>
+        <w:ind w:hanging="426" w:left="426"/>
         <w:rPr>
           <w:lang w:val="en-GB"/>
         </w:rPr>
       </w:pPr>
       <w:bookmarkStart w:id="6" w:name="__RefHeading___Toc619_343945465"/>
-      <w:bookmarkStart w:id="7" w:name="_Toc518373994"/>
-      <w:bookmarkStart w:id="8" w:name="_Toc518369838"/>
-      <w:bookmarkStart w:id="9" w:name="_Toc516650487"/>
-      <w:bookmarkStart w:id="10" w:name="_Toc516556279"/>
+      <w:bookmarkStart w:id="7" w:name="_Toc516556279"/>
+      <w:bookmarkStart w:id="8" w:name="_Toc516650487"/>
+      <w:bookmarkStart w:id="9" w:name="_Toc518369838"/>
+      <w:bookmarkStart w:id="10" w:name="_Toc518373994"/>
       <w:bookmarkEnd w:id="6"/>
       <w:r>
         <w:rPr>
@@ -2397,13 +2644,7 @@
         <w:rPr>
           <w:lang w:val="pl-PL" w:eastAsia="en-US"/>
         </w:rPr>
-        <w:t xml:space="preserve">Na przestrzeni ostatnich lat systemy oparte na technologii </w:t>
-      </w:r>
-      <w:r>
-        <w:rPr>
-          <w:lang w:val="pl-PL" w:eastAsia="en-US"/>
-        </w:rPr>
-        <w:t xml:space="preserve">wirtualnej rzeczywistości (and. </w:t>
+        <w:t xml:space="preserve">Na przestrzeni ostatnich lat systemy oparte na technologii wirtualnej rzeczywistości (and. </w:t>
       </w:r>
       <w:r>
         <w:rPr>
@@ -2417,13 +2658,7 @@
         <w:rPr>
           <w:lang w:val="pl-PL" w:eastAsia="en-US"/>
         </w:rPr>
-        <w:t>)</w:t>
-      </w:r>
-      <w:r>
-        <w:rPr>
-          <w:lang w:val="pl-PL" w:eastAsia="en-US"/>
-        </w:rPr>
-        <w:t xml:space="preserve"> zyskały popularność, w szczególności tzw. zestawy nagłowne (ang. </w:t>
+        <w:t xml:space="preserve">) zyskały popularność, w szczególności tzw. zestawy nagłowne (ang. </w:t>
       </w:r>
       <w:r>
         <w:rPr>
@@ -2437,49 +2672,7 @@
         <w:rPr>
           <w:lang w:val="pl-PL" w:eastAsia="en-US"/>
         </w:rPr>
-        <w:t xml:space="preserve">). Możliwości takiego rozwiązania są jednak ograniczone i nie pozwalają na pełną immersję w wirtualną rzeczywistość – gracz nie widzi w świecie ani swojego ciała, ani prawdziwych ciał swoich współgraczy, jedynie ich awatary; przestrzeń, po której gracz może się poruszać jest często bardzo ograniczona, przez co w rzeczywistości albo gracz biega w miejscu dla symulacji ruchu, albo gra odpowiednio manipuluje wyświetlaną przestrzenią tak, aby gracz mógł się poruszać tylko po ograniczonej przestrzeni; </w:t>
-      </w:r>
-      <w:r>
-        <w:rPr>
-          <w:lang w:val="pl-PL" w:eastAsia="en-US"/>
-        </w:rPr>
-        <w:t>gogle</w:t>
-      </w:r>
-      <w:r>
-        <w:rPr>
-          <w:lang w:val="pl-PL" w:eastAsia="en-US"/>
-        </w:rPr>
-        <w:t xml:space="preserve"> VR będące najpopularniejszym rozwiązaniem na korzystanie z technologii VR, są sporym obciążeniem dla osoby grającej, co ogranicza swobodę. Dużo droższym, aczkolwiek wygodniejszym i bardziej immersyjnym rozwiązaniem są instalacje t</w:t>
-      </w:r>
-      <w:r>
-        <w:rPr>
-          <w:lang w:val="pl-PL" w:eastAsia="en-US"/>
-        </w:rPr>
-        <w:t>akie jak</w:t>
-      </w:r>
-      <w:r>
-        <w:rPr>
-          <w:lang w:val="pl-PL" w:eastAsia="en-US"/>
-        </w:rPr>
-        <w:t xml:space="preserve"> </w:t>
-      </w:r>
-      <w:r>
-        <w:rPr>
-          <w:lang w:val="pl-PL" w:eastAsia="en-US"/>
-        </w:rPr>
-        <w:t>jaskinie VR</w:t>
-      </w:r>
-      <w:r>
-        <w:rPr>
-          <w:lang w:val="pl-PL" w:eastAsia="en-US"/>
-        </w:rPr>
-        <w:t xml:space="preserve"> </w:t>
-      </w:r>
-      <w:r>
-        <w:rPr>
-          <w:lang w:val="pl-PL" w:eastAsia="en-US"/>
-        </w:rPr>
-        <w:t>(ang.</w:t>
+        <w:t>). Możliwości takiego rozwiązania są jednak ograniczone i nie pozwalają na pełną immersję w wirtualną rzeczywistość – gracz nie widzi w świecie ani swojego ciała, ani prawdziwych ciał swoich współgraczy, jedynie ich awatary; przestrzeń, po której gracz może się poruszać jest często bardzo ograniczona, przez co w rzeczywistości albo gracz biega w miejscu dla symulacji ruchu, albo gra odpowiednio manipuluje wyświetlaną przestrzenią tak, aby gracz mógł się poruszać tylko po ograniczonej przestrzeni; gogle VR będące najpopularniejszym rozwiązaniem na korzystanie z technologii VR, są sporym obciążeniem dla osoby grającej, co ogranicza swobodę. Dużo droższym, aczkolwiek wygodniejszym i bardziej immersyjnym rozwiązaniem są instalacje takie jak jaskinie VR (ang.</w:t>
       </w:r>
       <w:r>
         <w:rPr>
@@ -2503,21 +2696,30 @@
           <w:iCs/>
           <w:lang w:val="pl-PL" w:eastAsia="en-US"/>
         </w:rPr>
-        <w:t xml:space="preserve"> </w:t>
-      </w:r>
-      <w:r>
-        <w:rPr>
-          <w:i/>
-          <w:iCs/>
+        <w:t xml:space="preserve">  </w:t>
+      </w:r>
+      <w:r>
+        <w:rPr>
           <w:lang w:val="pl-PL" w:eastAsia="en-US"/>
         </w:rPr>
-        <w:t xml:space="preserve"> </w:t>
-      </w:r>
-      <w:r>
+        <w:t xml:space="preserve">[1].  Przykładowa konstrukcja tego rodzaju znajduje się w Laboratorium Zanurzonej Wirtualizacji Przestrzennej na Politechnice Gdańskiej. Korzystanie z takiej instalacji jest dużo bardziej swobodne niż w przypadku zestawu nagłownego oraz jest bardziej zbliżone do doświadczeń w świecie rzeczywistym. </w:t>
+      </w:r>
+    </w:p>
+    <w:p>
+      <w:pPr>
+        <w:pStyle w:val="Normal"/>
+        <w:spacing w:lineRule="auto" w:line="360" w:before="0" w:after="120"/>
+        <w:ind w:firstLine="708"/>
+        <w:jc w:val="both"/>
         <w:rPr>
           <w:lang w:val="pl-PL" w:eastAsia="en-US"/>
         </w:rPr>
-        <w:t xml:space="preserve">[1].  Przykładowa konstrukcja tego rodzaju znajduje się w Laboratorium Zanurzonej Wirtualizacji Przestrzennej na Politechnice Gdańskiej. Korzystanie z takiej instalacji jest dużo bardziej swobodne niż w przypadku zestawu nagłownego oraz jest bardziej zbliżone do doświadczeń w świecie rzeczywistym. </w:t>
+      </w:pPr>
+      <w:r>
+        <w:rPr>
+          <w:lang w:val="pl-PL" w:eastAsia="en-US"/>
+        </w:rPr>
+        <w:t>W ramach niniejszej pracy dyplomowej zespół projektowy postanowił stworzyć przykładową aplikację docelowo wykorzystywaną w LZWP, umożliwiającą obsługę dwóch osób jednocześnie. Aby zaprezentować możliwości synchronizacji akcji obu użytkowników, zadecydowano, że aplikacja będzie grą dwuosobową w wirtualnej rzeczywistości o pokonywaniu duchów, wymagającą kooperacji pomiędzy dwoma graczami.</w:t>
       </w:r>
     </w:p>
     <w:p>
@@ -2534,43 +2736,37 @@
         <w:rPr>
           <w:lang w:val="pl-PL" w:eastAsia="en-US"/>
         </w:rPr>
-        <w:t>W ramach niniejszej pracy dyplomowej zespół projektowy postanowił stworzyć przykładową aplikację docelowo wykorzystywaną w LZWP, umożliwiającą obsługę dwóch osób jednocześnie. Aby zaprezentować możliwości synchronizacji akcji obu użytkowników, zadecydowano, że aplikacja będzie grą dwuosobową w wirtualnej rzeczywistości o pokonywaniu duchów, wymagającą kooperacji pomiędzy dwoma graczami.</w:t>
-      </w:r>
-    </w:p>
-    <w:p>
-      <w:pPr>
-        <w:pStyle w:val="Normal"/>
-        <w:spacing w:lineRule="auto" w:line="360" w:before="0" w:after="120"/>
-        <w:ind w:firstLine="708"/>
-        <w:jc w:val="both"/>
+        <w:t xml:space="preserve">W rozdziale drugim pracy dokładniej wyjaśniono definicję wirtualnej rzeczywistości, opisano historię rozwoju tej technologii oraz obecne rozwiązania. </w:t>
+      </w:r>
+      <w:r>
         <w:rPr>
           <w:lang w:val="pl-PL" w:eastAsia="en-US"/>
         </w:rPr>
-      </w:pPr>
+        <w:t xml:space="preserve">Rozdział trzeci poświęcony został szczegółowej charakterystyce rodzaju instalacji jaskiń VR – BigCAVE, dla którego tworzona była gra. W rozdziale czwartym doprecyzowano cele pracy, przeprowadzono analizę wymagań funkcjonalnych oraz analizę ryzyka, a także przedstawiono planowany sposób realizacji projektu i harmonogram pracy. </w:t>
+      </w:r>
       <w:r>
         <w:rPr>
           <w:lang w:val="pl-PL" w:eastAsia="en-US"/>
         </w:rPr>
-        <w:t xml:space="preserve">W rozdziale drugim pracy </w:t>
+        <w:t xml:space="preserve">Rozdział piąty zawiera ogólny projekt systemu. Szczegóły procesu implementacji oraz weryfikowania uzyskanych rozwiązań przedstawiono w rozdziale szóstym. W rozdziale siódmym opisano przebieg badania doświadczeń osób trzecich korzystających z systemu i wyciągnięto wnioski z uzyskanych odpowiedzi. Ogólne wnioski i </w:t>
       </w:r>
       <w:r>
         <w:rPr>
           <w:lang w:val="pl-PL" w:eastAsia="en-US"/>
         </w:rPr>
-        <w:t>dokładniej wyjaśniono definicję wirtualnej rzeczywistości, opisano historię rozwoju tej technologii oraz obecne rozwiązania.</w:t>
-      </w:r>
-    </w:p>
-    <w:p>
-      <w:pPr>
-        <w:pStyle w:val="Nagwek1"/>
+        <w:t>rozliczenie przebiegu pracy nad projektem zawarto w podsumowaniu.</w:t>
+      </w:r>
+    </w:p>
+    <w:p>
+      <w:pPr>
+        <w:pStyle w:val="Heading1"/>
         <w:numPr>
           <w:ilvl w:val="0"/>
           <w:numId w:val="1"/>
         </w:numPr>
-        <w:ind w:left="426" w:hanging="426"/>
-        <w:jc w:val="both"/>
-        <w:rPr>
-          <w:b w:val="false"/>
+        <w:ind w:hanging="426" w:left="426"/>
+        <w:jc w:val="both"/>
+        <w:rPr>
           <w:b w:val="false"/>
           <w:sz w:val="20"/>
           <w:lang w:val="pl-PL"/>
@@ -2585,10 +2781,10 @@
         </w:rPr>
         <w:t>WIRTUALNA RZECZYWISTOŚĆ</w:t>
       </w:r>
-      <w:bookmarkStart w:id="12" w:name="_Toc518373995"/>
-      <w:bookmarkStart w:id="13" w:name="_Toc518369839"/>
-      <w:bookmarkStart w:id="14" w:name="_Toc516650488"/>
-      <w:bookmarkStart w:id="15" w:name="_Toc516556280"/>
+      <w:bookmarkStart w:id="12" w:name="_Toc516556280"/>
+      <w:bookmarkStart w:id="13" w:name="_Toc516650488"/>
+      <w:bookmarkStart w:id="14" w:name="_Toc518369839"/>
+      <w:bookmarkStart w:id="15" w:name="_Toc518373995"/>
       <w:r>
         <w:rPr>
           <w:lang w:val="pl-PL"/>
@@ -2615,30 +2811,70 @@
         <w:ind w:firstLine="708"/>
         <w:jc w:val="both"/>
         <w:rPr>
-          <w:rFonts w:ascii="Arial" w:hAnsi="Arial" w:cs="Arial"/>
-          <w:sz w:val="20"/>
-          <w:szCs w:val="20"/>
-          <w:lang w:val="en-GB"/>
-        </w:rPr>
-      </w:pPr>
-      <w:r>
-        <w:rPr>
-          <w:rFonts w:cs="Arial" w:ascii="Arial" w:hAnsi="Arial"/>
-          <w:sz w:val="20"/>
-          <w:szCs w:val="20"/>
-          <w:lang w:val="en-GB"/>
-        </w:rPr>
-        <w:t>Ogólnie o tym czym jest rzeczywistość wirtualna, o czym będzie rozdział. Xxxxxxxx xxxxxxx xxxxxxxx xxxxxxxxxxxx xxxxxxxx x xxxxxxxxx. Xxxxx xxxxxxxxx xxxx xxxxxx xxxxx. Xxxxxxxx xxxxxxx xxxxxxxx xxxxxxxxxxxx xxxxxxxx x xxxxxxxxx. Xxxxxxxx xxxxxxx xxxxxxxx xxxxxxxxxxxx xxxxxxxx x xxxxxxxxx.</w:t>
-      </w:r>
-    </w:p>
-    <w:p>
-      <w:pPr>
-        <w:pStyle w:val="Nagwek2"/>
+          <w:lang w:val="pl-PL" w:eastAsia="en-US" w:bidi="ar-SA"/>
+        </w:rPr>
+      </w:pPr>
+      <w:r>
+        <w:rPr>
+          <w:lang w:val="pl-PL" w:eastAsia="en-US" w:bidi="ar-SA"/>
+        </w:rPr>
+        <w:t xml:space="preserve">Choć obecnie technologia rzeczywistości wirtualnej jest bardzo rozpowszechniona, wiele osób błędnie ją definiuje. </w:t>
+      </w:r>
+      <w:r>
+        <w:rPr>
+          <w:lang w:val="pl-PL" w:eastAsia="en-US" w:bidi="ar-SA"/>
+        </w:rPr>
+        <w:t xml:space="preserve">Pojęcia, z którymi najczęściej mylona jest wirtualna rzeczywistość to teleobecność (ang. </w:t>
+      </w:r>
+      <w:r>
+        <w:rPr>
+          <w:i/>
+          <w:iCs/>
+          <w:lang w:val="pl-PL" w:eastAsia="en-US" w:bidi="ar-SA"/>
+        </w:rPr>
+        <w:t>telepresence</w:t>
+      </w:r>
+      <w:r>
+        <w:rPr>
+          <w:i w:val="false"/>
+          <w:iCs w:val="false"/>
+          <w:lang w:val="pl-PL" w:eastAsia="en-US" w:bidi="ar-SA"/>
+        </w:rPr>
+        <w:t xml:space="preserve">), czyli technika, dzięki której użytkownik czuje się, jakby był w odległym miejscu bez zmiany lokalizacji oraz rzeczywistość rozszerzona (ang. </w:t>
+      </w:r>
+      <w:r>
+        <w:rPr>
+          <w:i/>
+          <w:iCs/>
+          <w:lang w:val="pl-PL" w:eastAsia="en-US" w:bidi="ar-SA"/>
+        </w:rPr>
+        <w:t>augmented reality AR</w:t>
+      </w:r>
+      <w:r>
+        <w:rPr>
+          <w:i w:val="false"/>
+          <w:iCs w:val="false"/>
+          <w:lang w:val="pl-PL" w:eastAsia="en-US" w:bidi="ar-SA"/>
+        </w:rPr>
+        <w:t xml:space="preserve">), w której elementy wirtualne współtworzą środowisko użytkownika wraz z elementami rzeczywistymi. To, co wyróżnia wirtualną rzeczywistość od wyżej wymienionych rozwiązań </w:t>
+      </w:r>
+      <w:r>
+        <w:rPr>
+          <w:i w:val="false"/>
+          <w:iCs w:val="false"/>
+          <w:lang w:val="pl-PL" w:eastAsia="en-US" w:bidi="ar-SA"/>
+        </w:rPr>
+        <w:t>to przede wszystkim całkowicie syntetyczne środowisko oraz responsywność systemu w czasie rzeczywistym na działania użytkownika [2]. Co więcej, interakcja użytkownika z systemem zachodzi poprzez różne kanały sensoryczne – wdoświadczenie wirtualnej rzeczywistości zaangażowane są wzrok, dźwięk, ruch, zapach, a nawet smak.</w:t>
+      </w:r>
+    </w:p>
+    <w:p>
+      <w:pPr>
+        <w:pStyle w:val="Heading2"/>
         <w:numPr>
           <w:ilvl w:val="1"/>
           <w:numId w:val="1"/>
         </w:numPr>
-        <w:ind w:left="426" w:hanging="426"/>
+        <w:ind w:hanging="426" w:left="426"/>
         <w:jc w:val="both"/>
         <w:rPr>
           <w:lang w:val="pl-PL"/>
@@ -2652,23 +2888,10 @@
         </w:rPr>
         <w:t>Historia rozwoju rzeczywistości wirtualnej</w:t>
       </w:r>
-      <w:bookmarkStart w:id="17" w:name="_Toc518373996"/>
-      <w:bookmarkStart w:id="18" w:name="_Toc518369840"/>
-      <w:bookmarkStart w:id="19" w:name="_Toc516650489"/>
-      <w:bookmarkStart w:id="20" w:name="_Toc516556281"/>
-      <w:r>
-        <w:rPr>
-          <w:lang w:val="pl-PL"/>
-        </w:rPr>
-        <w:t xml:space="preserve"> </w:t>
-      </w:r>
-      <w:r>
-        <w:rPr>
-          <w:b w:val="false"/>
-          <w:lang w:val="pl-PL"/>
-        </w:rPr>
-        <w:t>(ewentualnie imię i nazwisko autora podrozdziału w przypadku pracy zbiorowej)</w:t>
-      </w:r>
+      <w:bookmarkStart w:id="17" w:name="_Toc516556281"/>
+      <w:bookmarkStart w:id="18" w:name="_Toc516650489"/>
+      <w:bookmarkStart w:id="19" w:name="_Toc518369840"/>
+      <w:bookmarkStart w:id="20" w:name="_Toc518373996"/>
       <w:bookmarkEnd w:id="17"/>
       <w:bookmarkEnd w:id="18"/>
       <w:bookmarkEnd w:id="19"/>
@@ -2681,30 +2904,417 @@
         <w:ind w:firstLine="708"/>
         <w:jc w:val="both"/>
         <w:rPr>
-          <w:rFonts w:ascii="Arial" w:hAnsi="Arial" w:cs="Arial"/>
-          <w:sz w:val="20"/>
-          <w:szCs w:val="20"/>
-          <w:lang w:val="en-GB"/>
-        </w:rPr>
-      </w:pPr>
-      <w:r>
-        <w:rPr>
-          <w:rFonts w:cs="Arial" w:ascii="Arial" w:hAnsi="Arial"/>
-          <w:sz w:val="20"/>
-          <w:szCs w:val="20"/>
-          <w:lang w:val="en-GB"/>
-        </w:rPr>
-        <w:t>Po kolei od pierwszych systemów do tego co mamy dzisiaj (na podstawie “Virtual Reality Technology”). Xxxxxxxx xxxxxxx xxxxxxxx xxxxxxxxxxxx xxxxxxxx x xxxxxxxxx. Xxxxx xxxxxxxxx xxxx xxxxxx xxxxx. Xxxxxxxx xxxxxxx xxxxxxxx xxxxxxxxxxxx xxxxxxxx x xxxxxxxxx. Xxxxxxxx xxxxxxx xxxxxxxx xxxxxxxxxxxx xxxxxxxx x xxxxxxxxx.</w:t>
-      </w:r>
-    </w:p>
-    <w:p>
-      <w:pPr>
-        <w:pStyle w:val="Nagwek2"/>
+          <w:lang w:val="pl-PL" w:eastAsia="en-US" w:bidi="ar-SA"/>
+        </w:rPr>
+      </w:pPr>
+      <w:r>
+        <w:rPr>
+          <w:lang w:val="pl-PL" w:eastAsia="en-US" w:bidi="ar-SA"/>
+        </w:rPr>
+        <w:t xml:space="preserve">Pierwsze kroki ku osiągnięciu technologii VR, jaką znamy dzisiaj, poczyniono już w latach 60. XX wieku. Jako początki wirtualnej rzeczywistości określa się wynalazek Amerykanina Mortona Heilinga nazwany przez niego Sensorama [2]. Maszyna ta pozwalała na doświadczenie symulacji jazdy motocyklem przez Nowy Jork i była dostosowana do tego, aby wpływać na większość ludzkich zmysłów. </w:t>
+      </w:r>
+      <w:r>
+        <w:rPr>
+          <w:lang w:val="pl-PL" w:eastAsia="en-US" w:bidi="ar-SA"/>
+        </w:rPr>
+        <w:t xml:space="preserve">Oprócz trójwymiarowego obrazu wideo Sensorama oferowała również dźwięk stereo, zapachy adekwatne do tego, co działo się na obrazie, efekt powiewu wiatru osiągany dzięki małym wiatrakom ustawionym przy głowie użytkownika oraz wibrujące siedzisko [2].  </w:t>
+      </w:r>
+    </w:p>
+    <w:p>
+      <w:pPr>
+        <w:pStyle w:val="Normal"/>
+        <w:spacing w:lineRule="auto" w:line="360" w:before="0" w:after="120"/>
+        <w:ind w:firstLine="708"/>
+        <w:jc w:val="both"/>
+        <w:rPr>
+          <w:lang w:val="pl-PL" w:eastAsia="en-US" w:bidi="ar-SA"/>
+        </w:rPr>
+      </w:pPr>
+      <w:r>
+        <w:rPr>
+          <w:lang w:val="pl-PL" w:eastAsia="en-US" w:bidi="ar-SA"/>
+        </w:rPr>
+        <w:drawing>
+          <wp:anchor behindDoc="0" distT="0" distB="0" distL="0" distR="0" simplePos="0" locked="0" layoutInCell="0" allowOverlap="1" relativeHeight="2">
+            <wp:simplePos x="0" y="0"/>
+            <wp:positionH relativeFrom="column">
+              <wp:posOffset>884555</wp:posOffset>
+            </wp:positionH>
+            <wp:positionV relativeFrom="paragraph">
+              <wp:posOffset>86995</wp:posOffset>
+            </wp:positionV>
+            <wp:extent cx="3782060" cy="4840605"/>
+            <wp:effectExtent l="0" t="0" r="0" b="0"/>
+            <wp:wrapSquare wrapText="largest"/>
+            <wp:docPr id="1" name="Obraz1" descr=""/>
+            <wp:cNvGraphicFramePr>
+              <a:graphicFrameLocks xmlns:a="http://schemas.openxmlformats.org/drawingml/2006/main" noChangeAspect="1"/>
+            </wp:cNvGraphicFramePr>
+            <a:graphic xmlns:a="http://schemas.openxmlformats.org/drawingml/2006/main">
+              <a:graphicData uri="http://schemas.openxmlformats.org/drawingml/2006/picture">
+                <pic:pic xmlns:pic="http://schemas.openxmlformats.org/drawingml/2006/picture">
+                  <pic:nvPicPr>
+                    <pic:cNvPr id="1" name="Obraz1" descr=""/>
+                    <pic:cNvPicPr>
+                      <a:picLocks noChangeAspect="1" noChangeArrowheads="1"/>
+                    </pic:cNvPicPr>
+                  </pic:nvPicPr>
+                  <pic:blipFill>
+                    <a:blip r:embed="rId8"/>
+                    <a:stretch>
+                      <a:fillRect/>
+                    </a:stretch>
+                  </pic:blipFill>
+                  <pic:spPr bwMode="auto">
+                    <a:xfrm>
+                      <a:off x="0" y="0"/>
+                      <a:ext cx="3782060" cy="4840605"/>
+                    </a:xfrm>
+                    <a:prstGeom prst="rect">
+                      <a:avLst/>
+                    </a:prstGeom>
+                  </pic:spPr>
+                </pic:pic>
+              </a:graphicData>
+            </a:graphic>
+          </wp:anchor>
+        </w:drawing>
+      </w:r>
+    </w:p>
+    <w:p>
+      <w:pPr>
+        <w:pStyle w:val="Normal"/>
+        <w:spacing w:lineRule="auto" w:line="360" w:before="0" w:after="120"/>
+        <w:ind w:firstLine="708"/>
+        <w:jc w:val="both"/>
+        <w:rPr>
+          <w:lang w:val="pl-PL" w:eastAsia="en-US" w:bidi="ar-SA"/>
+        </w:rPr>
+      </w:pPr>
+      <w:r>
+        <w:rPr>
+          <w:lang w:val="pl-PL" w:eastAsia="en-US" w:bidi="ar-SA"/>
+        </w:rPr>
+      </w:r>
+    </w:p>
+    <w:p>
+      <w:pPr>
+        <w:pStyle w:val="Normal"/>
+        <w:spacing w:lineRule="auto" w:line="360" w:before="0" w:after="120"/>
+        <w:ind w:firstLine="708"/>
+        <w:jc w:val="both"/>
+        <w:rPr>
+          <w:lang w:val="pl-PL" w:eastAsia="en-US" w:bidi="ar-SA"/>
+        </w:rPr>
+      </w:pPr>
+      <w:r>
+        <w:rPr>
+          <w:lang w:val="pl-PL" w:eastAsia="en-US" w:bidi="ar-SA"/>
+        </w:rPr>
+      </w:r>
+    </w:p>
+    <w:p>
+      <w:pPr>
+        <w:pStyle w:val="Normal"/>
+        <w:spacing w:lineRule="auto" w:line="360" w:before="0" w:after="120"/>
+        <w:ind w:firstLine="708"/>
+        <w:jc w:val="both"/>
+        <w:rPr>
+          <w:lang w:val="pl-PL" w:eastAsia="en-US" w:bidi="ar-SA"/>
+        </w:rPr>
+      </w:pPr>
+      <w:r>
+        <w:rPr>
+          <w:lang w:val="pl-PL" w:eastAsia="en-US" w:bidi="ar-SA"/>
+        </w:rPr>
+      </w:r>
+    </w:p>
+    <w:p>
+      <w:pPr>
+        <w:pStyle w:val="Normal"/>
+        <w:spacing w:lineRule="auto" w:line="360" w:before="0" w:after="120"/>
+        <w:ind w:firstLine="708"/>
+        <w:jc w:val="both"/>
+        <w:rPr>
+          <w:lang w:val="pl-PL" w:eastAsia="en-US" w:bidi="ar-SA"/>
+        </w:rPr>
+      </w:pPr>
+      <w:r>
+        <w:rPr>
+          <w:lang w:val="pl-PL" w:eastAsia="en-US" w:bidi="ar-SA"/>
+        </w:rPr>
+      </w:r>
+    </w:p>
+    <w:p>
+      <w:pPr>
+        <w:pStyle w:val="Normal"/>
+        <w:spacing w:lineRule="auto" w:line="360" w:before="0" w:after="120"/>
+        <w:ind w:firstLine="708"/>
+        <w:jc w:val="both"/>
+        <w:rPr>
+          <w:lang w:val="pl-PL" w:eastAsia="en-US" w:bidi="ar-SA"/>
+        </w:rPr>
+      </w:pPr>
+      <w:r>
+        <w:rPr>
+          <w:lang w:val="pl-PL" w:eastAsia="en-US" w:bidi="ar-SA"/>
+        </w:rPr>
+      </w:r>
+    </w:p>
+    <w:p>
+      <w:pPr>
+        <w:pStyle w:val="Normal"/>
+        <w:spacing w:lineRule="auto" w:line="360" w:before="0" w:after="120"/>
+        <w:ind w:firstLine="708"/>
+        <w:jc w:val="both"/>
+        <w:rPr>
+          <w:lang w:val="pl-PL" w:eastAsia="en-US" w:bidi="ar-SA"/>
+        </w:rPr>
+      </w:pPr>
+      <w:r>
+        <w:rPr>
+          <w:lang w:val="pl-PL" w:eastAsia="en-US" w:bidi="ar-SA"/>
+        </w:rPr>
+      </w:r>
+    </w:p>
+    <w:p>
+      <w:pPr>
+        <w:pStyle w:val="Normal"/>
+        <w:spacing w:lineRule="auto" w:line="360" w:before="0" w:after="120"/>
+        <w:ind w:firstLine="708"/>
+        <w:jc w:val="both"/>
+        <w:rPr>
+          <w:lang w:val="pl-PL" w:eastAsia="en-US" w:bidi="ar-SA"/>
+        </w:rPr>
+      </w:pPr>
+      <w:r>
+        <w:rPr>
+          <w:lang w:val="pl-PL" w:eastAsia="en-US" w:bidi="ar-SA"/>
+        </w:rPr>
+      </w:r>
+    </w:p>
+    <w:p>
+      <w:pPr>
+        <w:pStyle w:val="Normal"/>
+        <w:spacing w:lineRule="auto" w:line="360" w:before="0" w:after="120"/>
+        <w:ind w:firstLine="708"/>
+        <w:jc w:val="both"/>
+        <w:rPr>
+          <w:lang w:val="pl-PL" w:eastAsia="en-US" w:bidi="ar-SA"/>
+        </w:rPr>
+      </w:pPr>
+      <w:r>
+        <w:rPr>
+          <w:lang w:val="pl-PL" w:eastAsia="en-US" w:bidi="ar-SA"/>
+        </w:rPr>
+      </w:r>
+    </w:p>
+    <w:p>
+      <w:pPr>
+        <w:pStyle w:val="Normal"/>
+        <w:spacing w:lineRule="auto" w:line="360" w:before="0" w:after="120"/>
+        <w:ind w:firstLine="708"/>
+        <w:jc w:val="both"/>
+        <w:rPr>
+          <w:lang w:val="pl-PL" w:eastAsia="en-US" w:bidi="ar-SA"/>
+        </w:rPr>
+      </w:pPr>
+      <w:r>
+        <w:rPr>
+          <w:lang w:val="pl-PL" w:eastAsia="en-US" w:bidi="ar-SA"/>
+        </w:rPr>
+      </w:r>
+    </w:p>
+    <w:p>
+      <w:pPr>
+        <w:pStyle w:val="Normal"/>
+        <w:spacing w:lineRule="auto" w:line="360" w:before="0" w:after="120"/>
+        <w:ind w:firstLine="708"/>
+        <w:jc w:val="both"/>
+        <w:rPr>
+          <w:lang w:val="pl-PL" w:eastAsia="en-US" w:bidi="ar-SA"/>
+        </w:rPr>
+      </w:pPr>
+      <w:r>
+        <w:rPr>
+          <w:lang w:val="pl-PL" w:eastAsia="en-US" w:bidi="ar-SA"/>
+        </w:rPr>
+      </w:r>
+    </w:p>
+    <w:p>
+      <w:pPr>
+        <w:pStyle w:val="Normal"/>
+        <w:spacing w:lineRule="auto" w:line="360" w:before="0" w:after="120"/>
+        <w:ind w:firstLine="708"/>
+        <w:jc w:val="both"/>
+        <w:rPr>
+          <w:lang w:val="pl-PL" w:eastAsia="en-US" w:bidi="ar-SA"/>
+        </w:rPr>
+      </w:pPr>
+      <w:r>
+        <w:rPr>
+          <w:lang w:val="pl-PL" w:eastAsia="en-US" w:bidi="ar-SA"/>
+        </w:rPr>
+      </w:r>
+    </w:p>
+    <w:p>
+      <w:pPr>
+        <w:pStyle w:val="Normal"/>
+        <w:spacing w:lineRule="auto" w:line="360" w:before="0" w:after="120"/>
+        <w:ind w:firstLine="708"/>
+        <w:jc w:val="both"/>
+        <w:rPr>
+          <w:lang w:val="pl-PL" w:eastAsia="en-US" w:bidi="ar-SA"/>
+        </w:rPr>
+      </w:pPr>
+      <w:r>
+        <w:rPr>
+          <w:lang w:val="pl-PL" w:eastAsia="en-US" w:bidi="ar-SA"/>
+        </w:rPr>
+      </w:r>
+    </w:p>
+    <w:p>
+      <w:pPr>
+        <w:pStyle w:val="Normal"/>
+        <w:spacing w:lineRule="auto" w:line="360" w:before="0" w:after="120"/>
+        <w:ind w:firstLine="708"/>
+        <w:jc w:val="both"/>
+        <w:rPr>
+          <w:lang w:val="pl-PL" w:eastAsia="en-US" w:bidi="ar-SA"/>
+        </w:rPr>
+      </w:pPr>
+      <w:r>
+        <w:rPr>
+          <w:lang w:val="pl-PL" w:eastAsia="en-US" w:bidi="ar-SA"/>
+        </w:rPr>
+      </w:r>
+    </w:p>
+    <w:p>
+      <w:pPr>
+        <w:pStyle w:val="Normal"/>
+        <w:spacing w:lineRule="auto" w:line="360" w:before="0" w:after="120"/>
+        <w:ind w:firstLine="708"/>
+        <w:jc w:val="both"/>
+        <w:rPr>
+          <w:lang w:val="pl-PL" w:eastAsia="en-US" w:bidi="ar-SA"/>
+        </w:rPr>
+      </w:pPr>
+      <w:r>
+        <w:rPr>
+          <w:lang w:val="pl-PL" w:eastAsia="en-US" w:bidi="ar-SA"/>
+        </w:rPr>
+      </w:r>
+    </w:p>
+    <w:p>
+      <w:pPr>
+        <w:pStyle w:val="Normal"/>
+        <w:spacing w:lineRule="auto" w:line="360" w:before="0" w:after="120"/>
+        <w:ind w:firstLine="708"/>
+        <w:jc w:val="center"/>
+        <w:rPr>
+          <w:lang w:val="pl-PL" w:eastAsia="en-US" w:bidi="ar-SA"/>
+        </w:rPr>
+      </w:pPr>
+      <w:r>
+        <w:rPr>
+          <w:lang w:val="pl-PL" w:eastAsia="en-US" w:bidi="ar-SA"/>
+        </w:rPr>
+        <w:t>Rysunek 2.1: Maszyna Sensorama</w:t>
+      </w:r>
+      <w:r>
+        <w:rPr>
+          <w:rStyle w:val="FootnoteReference"/>
+          <w:lang w:val="pl-PL" w:eastAsia="en-US" w:bidi="ar-SA"/>
+        </w:rPr>
+        <w:footnoteReference w:id="2"/>
+      </w:r>
+    </w:p>
+    <w:p>
+      <w:pPr>
+        <w:pStyle w:val="Normal"/>
+        <w:spacing w:lineRule="auto" w:line="360" w:before="0" w:after="120"/>
+        <w:ind w:hanging="0"/>
+        <w:jc w:val="both"/>
+        <w:rPr>
+          <w:lang w:val="pl-PL" w:eastAsia="en-US" w:bidi="ar-SA"/>
+        </w:rPr>
+      </w:pPr>
+      <w:r>
+        <w:rPr>
+          <w:lang w:val="pl-PL" w:eastAsia="en-US" w:bidi="ar-SA"/>
+        </w:rPr>
+        <w:tab/>
+        <w:t xml:space="preserve">Niedaleko stała Sensorama od niedługo później opracowywanych zestawów nagłownych (ang. </w:t>
+      </w:r>
+      <w:r>
+        <w:rPr>
+          <w:i/>
+          <w:iCs/>
+          <w:lang w:val="pl-PL" w:eastAsia="en-US" w:bidi="ar-SA"/>
+        </w:rPr>
+        <w:t>head-mounted display HMD</w:t>
+      </w:r>
+      <w:r>
+        <w:rPr>
+          <w:i w:val="false"/>
+          <w:iCs w:val="false"/>
+          <w:lang w:val="pl-PL" w:eastAsia="en-US" w:bidi="ar-SA"/>
+        </w:rPr>
+        <w:t>)</w:t>
+      </w:r>
+      <w:r>
+        <w:rPr>
+          <w:lang w:val="pl-PL" w:eastAsia="en-US" w:bidi="ar-SA"/>
+        </w:rPr>
+        <w:t xml:space="preserve">. Sam Heilig zaprojektował maskę symulującą wirtualną rzeczywistość. </w:t>
+      </w:r>
+      <w:r>
+        <w:rPr>
+          <w:lang w:val="pl-PL" w:eastAsia="en-US" w:bidi="ar-SA"/>
+        </w:rPr>
+        <w:t xml:space="preserve">Jego projekt był następnie kontynuowany przez Ivana Sutherlanda, który wzbogacił maskę Heiliga o dwa kineskopy – to rozwiązanie jest stosowane nawet w dzisiejszych zestawach nagłownych. Co więcej, Sutherland postanowił zastąpić analogowe zdjęcia generowanymi komputerowo obrazami. </w:t>
+      </w:r>
+    </w:p>
+    <w:p>
+      <w:pPr>
+        <w:pStyle w:val="Normal"/>
+        <w:spacing w:lineRule="auto" w:line="360" w:before="0" w:after="120"/>
+        <w:ind w:hanging="0"/>
+        <w:jc w:val="center"/>
+        <w:rPr>
+          <w:lang w:val="pl-PL" w:eastAsia="en-US" w:bidi="ar-SA"/>
+        </w:rPr>
+      </w:pPr>
+      <w:r>
+        <w:rPr>
+          <w:lang w:val="pl-PL" w:eastAsia="en-US" w:bidi="ar-SA"/>
+        </w:rPr>
+      </w:r>
+    </w:p>
+    <w:p>
+      <w:pPr>
+        <w:pStyle w:val="Normal"/>
+        <w:spacing w:lineRule="auto" w:line="360" w:before="0" w:after="120"/>
+        <w:ind w:firstLine="708"/>
+        <w:jc w:val="both"/>
+        <w:rPr>
+          <w:lang w:val="pl-PL" w:eastAsia="en-US" w:bidi="ar-SA"/>
+        </w:rPr>
+      </w:pPr>
+      <w:r>
+        <w:rPr>
+          <w:lang w:val="pl-PL" w:eastAsia="en-US" w:bidi="ar-SA"/>
+        </w:rPr>
+      </w:r>
+    </w:p>
+    <w:p>
+      <w:pPr>
+        <w:pStyle w:val="Heading2"/>
         <w:numPr>
           <w:ilvl w:val="1"/>
           <w:numId w:val="1"/>
         </w:numPr>
-        <w:ind w:left="426" w:hanging="426"/>
+        <w:ind w:hanging="426" w:left="426"/>
         <w:jc w:val="both"/>
         <w:rPr>
           <w:lang w:val="pl-PL"/>
@@ -2718,10 +3328,10 @@
         </w:rPr>
         <w:t>Nowoczesne rozwiązania dla technologii wirtualnej rzeczywistości</w:t>
       </w:r>
-      <w:bookmarkStart w:id="22" w:name="_Toc518373998"/>
-      <w:bookmarkStart w:id="23" w:name="_Toc518369842"/>
-      <w:bookmarkStart w:id="24" w:name="_Toc516650491"/>
-      <w:bookmarkStart w:id="25" w:name="_Toc516556283"/>
+      <w:bookmarkStart w:id="22" w:name="_Toc516556283"/>
+      <w:bookmarkStart w:id="23" w:name="_Toc516650491"/>
+      <w:bookmarkStart w:id="24" w:name="_Toc518369842"/>
+      <w:bookmarkStart w:id="25" w:name="_Toc518373998"/>
       <w:r>
         <w:rPr>
           <w:lang w:val="pl-PL"/>
@@ -2765,21 +3375,21 @@
     </w:p>
     <w:p>
       <w:pPr>
-        <w:pStyle w:val="Nagwek1"/>
+        <w:pStyle w:val="Heading1"/>
         <w:numPr>
           <w:ilvl w:val="0"/>
           <w:numId w:val="1"/>
         </w:numPr>
-        <w:ind w:left="426" w:hanging="426"/>
+        <w:ind w:hanging="426" w:left="426"/>
         <w:rPr>
           <w:lang w:val="en-GB"/>
         </w:rPr>
       </w:pPr>
       <w:bookmarkStart w:id="26" w:name="__RefHeading___Toc629_343945465"/>
-      <w:bookmarkStart w:id="27" w:name="_Toc518373999"/>
-      <w:bookmarkStart w:id="28" w:name="_Toc518369843"/>
-      <w:bookmarkStart w:id="29" w:name="_Toc516650492"/>
-      <w:bookmarkStart w:id="30" w:name="_Toc516556284"/>
+      <w:bookmarkStart w:id="27" w:name="_Toc516556284"/>
+      <w:bookmarkStart w:id="28" w:name="_Toc516650492"/>
+      <w:bookmarkStart w:id="29" w:name="_Toc518369843"/>
+      <w:bookmarkStart w:id="30" w:name="_Toc518373999"/>
       <w:bookmarkEnd w:id="26"/>
       <w:r>
         <w:rPr>
@@ -2823,12 +3433,12 @@
     </w:p>
     <w:p>
       <w:pPr>
-        <w:pStyle w:val="Nagwek2"/>
+        <w:pStyle w:val="Heading2"/>
         <w:numPr>
           <w:ilvl w:val="1"/>
           <w:numId w:val="1"/>
         </w:numPr>
-        <w:ind w:left="426" w:hanging="426"/>
+        <w:ind w:hanging="426" w:left="426"/>
         <w:jc w:val="both"/>
         <w:rPr>
           <w:lang w:val="pl-PL"/>
@@ -2842,10 +3452,10 @@
         </w:rPr>
         <w:t>Zasady działania Laboratorium Zanurzonej Wizualizacji Przestrzennej</w:t>
       </w:r>
-      <w:bookmarkStart w:id="32" w:name="_Toc518373996_kopia_1"/>
-      <w:bookmarkStart w:id="33" w:name="_Toc518369840_kopia_1"/>
-      <w:bookmarkStart w:id="34" w:name="_Toc516650489_kopia_1"/>
-      <w:bookmarkStart w:id="35" w:name="_Toc516556281_kopia_1"/>
+      <w:bookmarkStart w:id="32" w:name="_Toc516556281_kopia_1"/>
+      <w:bookmarkStart w:id="33" w:name="_Toc516650489_kopia_1"/>
+      <w:bookmarkStart w:id="34" w:name="_Toc518369840_kopia_1"/>
+      <w:bookmarkStart w:id="35" w:name="_Toc518373996_kopia_1"/>
       <w:r>
         <w:rPr>
           <w:lang w:val="pl-PL"/>
@@ -2889,12 +3499,12 @@
     </w:p>
     <w:p>
       <w:pPr>
-        <w:pStyle w:val="Nagwek2"/>
+        <w:pStyle w:val="Heading2"/>
         <w:numPr>
           <w:ilvl w:val="1"/>
           <w:numId w:val="1"/>
         </w:numPr>
-        <w:ind w:left="426" w:hanging="426"/>
+        <w:ind w:hanging="426" w:left="426"/>
         <w:jc w:val="both"/>
         <w:rPr>
           <w:lang w:val="pl-PL"/>
@@ -2908,10 +3518,10 @@
         </w:rPr>
         <w:t>Narzędzia używane do tworzenia aplikacji dla LZWP</w:t>
       </w:r>
-      <w:bookmarkStart w:id="37" w:name="_Toc518373996_kopia_1_kopia_1"/>
-      <w:bookmarkStart w:id="38" w:name="_Toc518369840_kopia_1_kopia_1"/>
-      <w:bookmarkStart w:id="39" w:name="_Toc516650489_kopia_1_kopia_1"/>
-      <w:bookmarkStart w:id="40" w:name="_Toc516556281_kopia_1_kopia_1"/>
+      <w:bookmarkStart w:id="37" w:name="_Toc516556281_kopia_1_kopia_1"/>
+      <w:bookmarkStart w:id="38" w:name="_Toc516650489_kopia_1_kopia_1"/>
+      <w:bookmarkStart w:id="39" w:name="_Toc518369840_kopia_1_kopia_1"/>
+      <w:bookmarkStart w:id="40" w:name="_Toc518373996_kopia_1_kopia_1"/>
       <w:r>
         <w:rPr>
           <w:lang w:val="pl-PL"/>
@@ -2955,12 +3565,12 @@
     </w:p>
     <w:p>
       <w:pPr>
-        <w:pStyle w:val="Nagwek1"/>
+        <w:pStyle w:val="Heading1"/>
         <w:numPr>
           <w:ilvl w:val="0"/>
           <w:numId w:val="1"/>
         </w:numPr>
-        <w:ind w:left="426" w:hanging="426"/>
+        <w:ind w:hanging="426" w:left="426"/>
         <w:rPr>
           <w:highlight w:val="none"/>
           <w:shd w:fill="81D41A" w:val="clear"/>
@@ -3001,12 +3611,12 @@
     </w:p>
     <w:p>
       <w:pPr>
-        <w:pStyle w:val="Nagwek2"/>
+        <w:pStyle w:val="Heading2"/>
         <w:numPr>
           <w:ilvl w:val="1"/>
           <w:numId w:val="1"/>
         </w:numPr>
-        <w:ind w:left="426" w:hanging="426"/>
+        <w:ind w:hanging="426" w:left="426"/>
         <w:jc w:val="both"/>
         <w:rPr>
           <w:lang w:val="pl-PL"/>
@@ -3020,10 +3630,10 @@
         </w:rPr>
         <w:t>Specyfikacja wymagań</w:t>
       </w:r>
-      <w:bookmarkStart w:id="43" w:name="_Toc518373996_kopia_1_kopia_3"/>
-      <w:bookmarkStart w:id="44" w:name="_Toc518369840_kopia_1_kopia_3"/>
-      <w:bookmarkStart w:id="45" w:name="_Toc516650489_kopia_1_kopia_3"/>
-      <w:bookmarkStart w:id="46" w:name="_Toc516556281_kopia_1_kopia_3"/>
+      <w:bookmarkStart w:id="43" w:name="_Toc516556281_kopia_1_kopia_3"/>
+      <w:bookmarkStart w:id="44" w:name="_Toc516650489_kopia_1_kopia_3"/>
+      <w:bookmarkStart w:id="45" w:name="_Toc518369840_kopia_1_kopia_3"/>
+      <w:bookmarkStart w:id="46" w:name="_Toc518373996_kopia_1_kopia_3"/>
       <w:r>
         <w:rPr>
           <w:lang w:val="pl-PL"/>
@@ -3067,21 +3677,21 @@
     </w:p>
     <w:p>
       <w:pPr>
-        <w:pStyle w:val="Nagwek3"/>
+        <w:pStyle w:val="Heading3"/>
         <w:numPr>
           <w:ilvl w:val="2"/>
           <w:numId w:val="1"/>
         </w:numPr>
-        <w:ind w:left="709" w:hanging="709"/>
+        <w:ind w:hanging="709" w:left="709"/>
         <w:rPr>
           <w:lang w:val="pl-PL" w:eastAsia="en-US" w:bidi="ar-SA"/>
         </w:rPr>
       </w:pPr>
       <w:bookmarkStart w:id="47" w:name="__RefHeading___Toc625_343945465_kopia_1"/>
-      <w:bookmarkStart w:id="48" w:name="_Toc518373997_kopia_1"/>
-      <w:bookmarkStart w:id="49" w:name="_Toc518369841_kopia_1"/>
-      <w:bookmarkStart w:id="50" w:name="_Toc516650490_kopia_1"/>
-      <w:bookmarkStart w:id="51" w:name="_Toc516556282_kopia_1"/>
+      <w:bookmarkStart w:id="48" w:name="_Toc516556282_kopia_1"/>
+      <w:bookmarkStart w:id="49" w:name="_Toc516650490_kopia_1"/>
+      <w:bookmarkStart w:id="50" w:name="_Toc518369841_kopia_1"/>
+      <w:bookmarkStart w:id="51" w:name="_Toc518373997_kopia_1"/>
       <w:bookmarkEnd w:id="47"/>
       <w:r>
         <w:rPr>
@@ -3122,12 +3732,12 @@
     </w:p>
     <w:p>
       <w:pPr>
-        <w:pStyle w:val="Nagwek3"/>
+        <w:pStyle w:val="Heading3"/>
         <w:numPr>
           <w:ilvl w:val="2"/>
           <w:numId w:val="1"/>
         </w:numPr>
-        <w:ind w:left="709" w:hanging="709"/>
+        <w:ind w:hanging="709" w:left="709"/>
         <w:rPr>
           <w:lang w:val="en-GB"/>
         </w:rPr>
@@ -3166,21 +3776,21 @@
     </w:p>
     <w:p>
       <w:pPr>
-        <w:pStyle w:val="Nagwek3"/>
+        <w:pStyle w:val="Heading3"/>
         <w:numPr>
           <w:ilvl w:val="2"/>
           <w:numId w:val="1"/>
         </w:numPr>
-        <w:ind w:left="709" w:hanging="709"/>
+        <w:ind w:hanging="709" w:left="709"/>
         <w:rPr>
           <w:lang w:val="en-GB"/>
         </w:rPr>
       </w:pPr>
       <w:bookmarkStart w:id="53" w:name="__RefHeading___Toc625_343945465_kopia_5"/>
-      <w:bookmarkStart w:id="54" w:name="_Toc518373997_kopia_6"/>
-      <w:bookmarkStart w:id="55" w:name="_Toc518369841_kopia_6"/>
-      <w:bookmarkStart w:id="56" w:name="_Toc516650490_kopia_6"/>
-      <w:bookmarkStart w:id="57" w:name="_Toc516556282_kopia_6"/>
+      <w:bookmarkStart w:id="54" w:name="_Toc516556282_kopia_6"/>
+      <w:bookmarkStart w:id="55" w:name="_Toc516650490_kopia_6"/>
+      <w:bookmarkStart w:id="56" w:name="_Toc518369841_kopia_6"/>
+      <w:bookmarkStart w:id="57" w:name="_Toc518373997_kopia_6"/>
       <w:bookmarkEnd w:id="53"/>
       <w:r>
         <w:rPr>
@@ -3224,12 +3834,12 @@
     </w:p>
     <w:p>
       <w:pPr>
-        <w:pStyle w:val="Nagwek2"/>
+        <w:pStyle w:val="Heading2"/>
         <w:numPr>
           <w:ilvl w:val="1"/>
           <w:numId w:val="1"/>
         </w:numPr>
-        <w:ind w:left="426" w:hanging="426"/>
+        <w:ind w:hanging="426" w:left="426"/>
         <w:jc w:val="both"/>
         <w:rPr>
           <w:lang w:val="pl-PL"/>
@@ -3243,10 +3853,10 @@
         </w:rPr>
         <w:t>Analiza wymagań funkcjonalnych</w:t>
       </w:r>
-      <w:bookmarkStart w:id="59" w:name="_Toc518373996_kopia_1_kopia_4"/>
-      <w:bookmarkStart w:id="60" w:name="_Toc518369840_kopia_1_kopia_4"/>
-      <w:bookmarkStart w:id="61" w:name="_Toc516650489_kopia_1_kopia_4"/>
-      <w:bookmarkStart w:id="62" w:name="_Toc516556281_kopia_1_kopia_4"/>
+      <w:bookmarkStart w:id="59" w:name="_Toc516556281_kopia_1_kopia_4"/>
+      <w:bookmarkStart w:id="60" w:name="_Toc516650489_kopia_1_kopia_4"/>
+      <w:bookmarkStart w:id="61" w:name="_Toc518369840_kopia_1_kopia_4"/>
+      <w:bookmarkStart w:id="62" w:name="_Toc518373996_kopia_1_kopia_4"/>
       <w:r>
         <w:rPr>
           <w:lang w:val="pl-PL"/>
@@ -3290,12 +3900,12 @@
     </w:p>
     <w:p>
       <w:pPr>
-        <w:pStyle w:val="Nagwek2"/>
+        <w:pStyle w:val="Heading2"/>
         <w:numPr>
           <w:ilvl w:val="1"/>
           <w:numId w:val="1"/>
         </w:numPr>
-        <w:ind w:left="426" w:hanging="426"/>
+        <w:ind w:hanging="426" w:left="426"/>
         <w:jc w:val="both"/>
         <w:rPr>
           <w:lang w:val="pl-PL"/>
@@ -3309,10 +3919,10 @@
         </w:rPr>
         <w:t>Analiza wymagań użytkowych</w:t>
       </w:r>
-      <w:bookmarkStart w:id="64" w:name="_Toc518373996_kopia_1_kopia_5"/>
-      <w:bookmarkStart w:id="65" w:name="_Toc518369840_kopia_1_kopia_5"/>
-      <w:bookmarkStart w:id="66" w:name="_Toc516650489_kopia_1_kopia_5"/>
-      <w:bookmarkStart w:id="67" w:name="_Toc516556281_kopia_1_kopia_5"/>
+      <w:bookmarkStart w:id="64" w:name="_Toc516556281_kopia_1_kopia_5"/>
+      <w:bookmarkStart w:id="65" w:name="_Toc516650489_kopia_1_kopia_5"/>
+      <w:bookmarkStart w:id="66" w:name="_Toc518369840_kopia_1_kopia_5"/>
+      <w:bookmarkStart w:id="67" w:name="_Toc518373996_kopia_1_kopia_5"/>
       <w:r>
         <w:rPr>
           <w:lang w:val="pl-PL"/>
@@ -3356,12 +3966,12 @@
     </w:p>
     <w:p>
       <w:pPr>
-        <w:pStyle w:val="Nagwek2"/>
+        <w:pStyle w:val="Heading2"/>
         <w:numPr>
           <w:ilvl w:val="1"/>
           <w:numId w:val="1"/>
         </w:numPr>
-        <w:ind w:left="426" w:hanging="426"/>
+        <w:ind w:hanging="426" w:left="426"/>
         <w:jc w:val="both"/>
         <w:rPr>
           <w:lang w:val="pl-PL"/>
@@ -3375,10 +3985,10 @@
         </w:rPr>
         <w:t>Kryteria akceptacji</w:t>
       </w:r>
-      <w:bookmarkStart w:id="69" w:name="_Toc518373996_kopia_1_kopia_6"/>
-      <w:bookmarkStart w:id="70" w:name="_Toc518369840_kopia_1_kopia_6"/>
-      <w:bookmarkStart w:id="71" w:name="_Toc516650489_kopia_1_kopia_6"/>
-      <w:bookmarkStart w:id="72" w:name="_Toc516556281_kopia_1_kopia_6"/>
+      <w:bookmarkStart w:id="69" w:name="_Toc516556281_kopia_1_kopia_6"/>
+      <w:bookmarkStart w:id="70" w:name="_Toc516650489_kopia_1_kopia_6"/>
+      <w:bookmarkStart w:id="71" w:name="_Toc518369840_kopia_1_kopia_6"/>
+      <w:bookmarkStart w:id="72" w:name="_Toc518373996_kopia_1_kopia_6"/>
       <w:r>
         <w:rPr>
           <w:lang w:val="pl-PL"/>
@@ -3422,12 +4032,12 @@
     </w:p>
     <w:p>
       <w:pPr>
-        <w:pStyle w:val="Nagwek2"/>
+        <w:pStyle w:val="Heading2"/>
         <w:numPr>
           <w:ilvl w:val="1"/>
           <w:numId w:val="1"/>
         </w:numPr>
-        <w:ind w:left="426" w:hanging="426"/>
+        <w:ind w:hanging="426" w:left="426"/>
         <w:jc w:val="both"/>
         <w:rPr>
           <w:lang w:val="pl-PL"/>
@@ -3441,10 +4051,10 @@
         </w:rPr>
         <w:t>Analiza ryzyka</w:t>
       </w:r>
-      <w:bookmarkStart w:id="74" w:name="_Toc518373996_kopia_1_kopia_7_kopia_1"/>
-      <w:bookmarkStart w:id="75" w:name="_Toc518369840_kopia_1_kopia_7_kopia_1"/>
-      <w:bookmarkStart w:id="76" w:name="_Toc516650489_kopia_1_kopia_7_kopia_1"/>
-      <w:bookmarkStart w:id="77" w:name="_Toc516556281_kopia_1_kopia_7_kopia_1"/>
+      <w:bookmarkStart w:id="74" w:name="_Toc516556281_kopia_1_kopia_7_kopia_1"/>
+      <w:bookmarkStart w:id="75" w:name="_Toc516650489_kopia_1_kopia_7_kopia_1"/>
+      <w:bookmarkStart w:id="76" w:name="_Toc518369840_kopia_1_kopia_7_kopia_1"/>
+      <w:bookmarkStart w:id="77" w:name="_Toc518373996_kopia_1_kopia_7_kopia_1"/>
       <w:r>
         <w:rPr>
           <w:lang w:val="pl-PL"/>
@@ -3488,12 +4098,12 @@
     </w:p>
     <w:p>
       <w:pPr>
-        <w:pStyle w:val="Nagwek2"/>
+        <w:pStyle w:val="Heading2"/>
         <w:numPr>
           <w:ilvl w:val="1"/>
           <w:numId w:val="1"/>
         </w:numPr>
-        <w:ind w:left="426" w:hanging="426"/>
+        <w:ind w:hanging="426" w:left="426"/>
         <w:jc w:val="both"/>
         <w:rPr>
           <w:lang w:val="pl-PL"/>
@@ -3507,10 +4117,10 @@
         </w:rPr>
         <w:t>Wybór środowiska implementacji</w:t>
       </w:r>
-      <w:bookmarkStart w:id="79" w:name="_Toc518373996_kopia_1_kopia_7"/>
-      <w:bookmarkStart w:id="80" w:name="_Toc518369840_kopia_1_kopia_7"/>
-      <w:bookmarkStart w:id="81" w:name="_Toc516650489_kopia_1_kopia_7"/>
-      <w:bookmarkStart w:id="82" w:name="_Toc516556281_kopia_1_kopia_7"/>
+      <w:bookmarkStart w:id="79" w:name="_Toc516556281_kopia_1_kopia_7"/>
+      <w:bookmarkStart w:id="80" w:name="_Toc516650489_kopia_1_kopia_7"/>
+      <w:bookmarkStart w:id="81" w:name="_Toc518369840_kopia_1_kopia_7"/>
+      <w:bookmarkStart w:id="82" w:name="_Toc518373996_kopia_1_kopia_7"/>
       <w:r>
         <w:rPr>
           <w:lang w:val="pl-PL"/>
@@ -3554,12 +4164,12 @@
     </w:p>
     <w:p>
       <w:pPr>
-        <w:pStyle w:val="Nagwek2"/>
+        <w:pStyle w:val="Heading2"/>
         <w:numPr>
           <w:ilvl w:val="1"/>
           <w:numId w:val="1"/>
         </w:numPr>
-        <w:ind w:left="426" w:hanging="426"/>
+        <w:ind w:hanging="426" w:left="426"/>
         <w:jc w:val="both"/>
         <w:rPr>
           <w:lang w:val="pl-PL"/>
@@ -3573,10 +4183,10 @@
         </w:rPr>
         <w:t>Rozszerzalność</w:t>
       </w:r>
-      <w:bookmarkStart w:id="84" w:name="_Toc518373996_kopia_1_kopia_8"/>
-      <w:bookmarkStart w:id="85" w:name="_Toc518369840_kopia_1_kopia_8"/>
-      <w:bookmarkStart w:id="86" w:name="_Toc516650489_kopia_1_kopia_8"/>
-      <w:bookmarkStart w:id="87" w:name="_Toc516556281_kopia_1_kopia_8"/>
+      <w:bookmarkStart w:id="84" w:name="_Toc516556281_kopia_1_kopia_8"/>
+      <w:bookmarkStart w:id="85" w:name="_Toc516650489_kopia_1_kopia_8"/>
+      <w:bookmarkStart w:id="86" w:name="_Toc518369840_kopia_1_kopia_8"/>
+      <w:bookmarkStart w:id="87" w:name="_Toc518373996_kopia_1_kopia_8"/>
       <w:r>
         <w:rPr>
           <w:lang w:val="pl-PL"/>
@@ -3620,12 +4230,12 @@
     </w:p>
     <w:p>
       <w:pPr>
-        <w:pStyle w:val="Nagwek2"/>
+        <w:pStyle w:val="Heading2"/>
         <w:numPr>
           <w:ilvl w:val="1"/>
           <w:numId w:val="1"/>
         </w:numPr>
-        <w:ind w:left="426" w:hanging="426"/>
+        <w:ind w:hanging="426" w:left="426"/>
         <w:jc w:val="both"/>
         <w:rPr>
           <w:lang w:val="pl-PL"/>
@@ -3639,10 +4249,10 @@
         </w:rPr>
         <w:t>Planowany sposób realizacji projektu</w:t>
       </w:r>
-      <w:bookmarkStart w:id="89" w:name="_Toc518373996_kopia_1_kopia_9"/>
-      <w:bookmarkStart w:id="90" w:name="_Toc518369840_kopia_1_kopia_9"/>
-      <w:bookmarkStart w:id="91" w:name="_Toc516650489_kopia_1_kopia_9"/>
-      <w:bookmarkStart w:id="92" w:name="_Toc516556281_kopia_1_kopia_9"/>
+      <w:bookmarkStart w:id="89" w:name="_Toc516556281_kopia_1_kopia_9"/>
+      <w:bookmarkStart w:id="90" w:name="_Toc516650489_kopia_1_kopia_9"/>
+      <w:bookmarkStart w:id="91" w:name="_Toc518369840_kopia_1_kopia_9"/>
+      <w:bookmarkStart w:id="92" w:name="_Toc518373996_kopia_1_kopia_9"/>
       <w:r>
         <w:rPr>
           <w:lang w:val="pl-PL"/>
@@ -3686,12 +4296,12 @@
     </w:p>
     <w:p>
       <w:pPr>
-        <w:pStyle w:val="Nagwek3"/>
+        <w:pStyle w:val="Heading3"/>
         <w:numPr>
           <w:ilvl w:val="2"/>
           <w:numId w:val="1"/>
         </w:numPr>
-        <w:ind w:left="709" w:hanging="709"/>
+        <w:ind w:hanging="709" w:left="709"/>
         <w:rPr>
           <w:lang w:val="en-GB"/>
         </w:rPr>
@@ -3730,12 +4340,12 @@
     </w:p>
     <w:p>
       <w:pPr>
-        <w:pStyle w:val="Nagwek2"/>
+        <w:pStyle w:val="Heading2"/>
         <w:numPr>
           <w:ilvl w:val="1"/>
           <w:numId w:val="1"/>
         </w:numPr>
-        <w:ind w:left="426" w:hanging="426"/>
+        <w:ind w:hanging="426" w:left="426"/>
         <w:jc w:val="both"/>
         <w:rPr>
           <w:lang w:val="pl-PL"/>
@@ -3749,10 +4359,10 @@
         </w:rPr>
         <w:t>Planowany harmonogram realizacji</w:t>
       </w:r>
-      <w:bookmarkStart w:id="95" w:name="_Toc518373996_kopia_1_kopia_9_kopia_3_ko"/>
-      <w:bookmarkStart w:id="96" w:name="_Toc518369840_kopia_1_kopia_9_kopia_3_ko"/>
-      <w:bookmarkStart w:id="97" w:name="_Toc516650489_kopia_1_kopia_9_kopia_3_ko"/>
-      <w:bookmarkStart w:id="98" w:name="_Toc516556281_kopia_1_kopia_9_kopia_3_ko"/>
+      <w:bookmarkStart w:id="95" w:name="_Toc516556281_kopia_1_kopia_9_kopia_3_ko"/>
+      <w:bookmarkStart w:id="96" w:name="_Toc516650489_kopia_1_kopia_9_kopia_3_ko"/>
+      <w:bookmarkStart w:id="97" w:name="_Toc518369840_kopia_1_kopia_9_kopia_3_ko"/>
+      <w:bookmarkStart w:id="98" w:name="_Toc518373996_kopia_1_kopia_9_kopia_3_ko"/>
       <w:r>
         <w:rPr>
           <w:lang w:val="pl-PL"/>
@@ -3796,12 +4406,12 @@
     </w:p>
     <w:p>
       <w:pPr>
-        <w:pStyle w:val="Nagwek1"/>
+        <w:pStyle w:val="Heading1"/>
         <w:numPr>
           <w:ilvl w:val="0"/>
           <w:numId w:val="1"/>
         </w:numPr>
-        <w:ind w:left="426" w:hanging="426"/>
+        <w:ind w:hanging="426" w:left="426"/>
         <w:rPr>
           <w:highlight w:val="none"/>
           <w:shd w:fill="81D41A" w:val="clear"/>
@@ -3842,12 +4452,12 @@
     </w:p>
     <w:p>
       <w:pPr>
-        <w:pStyle w:val="Nagwek2"/>
+        <w:pStyle w:val="Heading2"/>
         <w:numPr>
           <w:ilvl w:val="1"/>
           <w:numId w:val="1"/>
         </w:numPr>
-        <w:ind w:left="426" w:hanging="426"/>
+        <w:ind w:hanging="426" w:left="426"/>
         <w:jc w:val="both"/>
         <w:rPr>
           <w:lang w:val="pl-PL"/>
@@ -3861,10 +4471,10 @@
         </w:rPr>
         <w:t>Architektura systemu</w:t>
       </w:r>
-      <w:bookmarkStart w:id="101" w:name="_Toc518373996_kopia_1_kopia_9_kopia_1"/>
-      <w:bookmarkStart w:id="102" w:name="_Toc518369840_kopia_1_kopia_9_kopia_1"/>
-      <w:bookmarkStart w:id="103" w:name="_Toc516650489_kopia_1_kopia_9_kopia_1"/>
-      <w:bookmarkStart w:id="104" w:name="_Toc516556281_kopia_1_kopia_9_kopia_1"/>
+      <w:bookmarkStart w:id="101" w:name="_Toc516556281_kopia_1_kopia_9_kopia_1"/>
+      <w:bookmarkStart w:id="102" w:name="_Toc516650489_kopia_1_kopia_9_kopia_1"/>
+      <w:bookmarkStart w:id="103" w:name="_Toc518369840_kopia_1_kopia_9_kopia_1"/>
+      <w:bookmarkStart w:id="104" w:name="_Toc518373996_kopia_1_kopia_9_kopia_1"/>
       <w:r>
         <w:rPr>
           <w:lang w:val="pl-PL"/>
@@ -3908,12 +4518,12 @@
     </w:p>
     <w:p>
       <w:pPr>
-        <w:pStyle w:val="Nagwek2"/>
+        <w:pStyle w:val="Heading2"/>
         <w:numPr>
           <w:ilvl w:val="1"/>
           <w:numId w:val="1"/>
         </w:numPr>
-        <w:ind w:left="426" w:hanging="426"/>
+        <w:ind w:hanging="426" w:left="426"/>
         <w:jc w:val="both"/>
         <w:rPr>
           <w:lang w:val="pl-PL"/>
@@ -3927,10 +4537,10 @@
         </w:rPr>
         <w:t>Przypadki użycia</w:t>
       </w:r>
-      <w:bookmarkStart w:id="106" w:name="_Toc518373996_kopia_1_kopia_9_kopia_2"/>
-      <w:bookmarkStart w:id="107" w:name="_Toc518369840_kopia_1_kopia_9_kopia_2"/>
-      <w:bookmarkStart w:id="108" w:name="_Toc516650489_kopia_1_kopia_9_kopia_2"/>
-      <w:bookmarkStart w:id="109" w:name="_Toc516556281_kopia_1_kopia_9_kopia_2"/>
+      <w:bookmarkStart w:id="106" w:name="_Toc516556281_kopia_1_kopia_9_kopia_2"/>
+      <w:bookmarkStart w:id="107" w:name="_Toc516650489_kopia_1_kopia_9_kopia_2"/>
+      <w:bookmarkStart w:id="108" w:name="_Toc518369840_kopia_1_kopia_9_kopia_2"/>
+      <w:bookmarkStart w:id="109" w:name="_Toc518373996_kopia_1_kopia_9_kopia_2"/>
       <w:r>
         <w:rPr>
           <w:lang w:val="pl-PL"/>
@@ -3974,12 +4584,12 @@
     </w:p>
     <w:p>
       <w:pPr>
-        <w:pStyle w:val="Nagwek2"/>
+        <w:pStyle w:val="Heading2"/>
         <w:numPr>
           <w:ilvl w:val="1"/>
           <w:numId w:val="1"/>
         </w:numPr>
-        <w:ind w:left="426" w:hanging="426"/>
+        <w:ind w:hanging="426" w:left="426"/>
         <w:jc w:val="both"/>
         <w:rPr>
           <w:lang w:val="pl-PL"/>
@@ -3993,10 +4603,10 @@
         </w:rPr>
         <w:t>Diagram klas</w:t>
       </w:r>
-      <w:bookmarkStart w:id="111" w:name="_Toc518373996_kopia_1_kopia_9_kopia_3"/>
-      <w:bookmarkStart w:id="112" w:name="_Toc518369840_kopia_1_kopia_9_kopia_3"/>
-      <w:bookmarkStart w:id="113" w:name="_Toc516650489_kopia_1_kopia_9_kopia_3"/>
-      <w:bookmarkStart w:id="114" w:name="_Toc516556281_kopia_1_kopia_9_kopia_3"/>
+      <w:bookmarkStart w:id="111" w:name="_Toc516556281_kopia_1_kopia_9_kopia_3"/>
+      <w:bookmarkStart w:id="112" w:name="_Toc516650489_kopia_1_kopia_9_kopia_3"/>
+      <w:bookmarkStart w:id="113" w:name="_Toc518369840_kopia_1_kopia_9_kopia_3"/>
+      <w:bookmarkStart w:id="114" w:name="_Toc518373996_kopia_1_kopia_9_kopia_3"/>
       <w:r>
         <w:rPr>
           <w:lang w:val="pl-PL"/>
@@ -4040,12 +4650,12 @@
     </w:p>
     <w:p>
       <w:pPr>
-        <w:pStyle w:val="Nagwek1"/>
+        <w:pStyle w:val="Heading1"/>
         <w:numPr>
           <w:ilvl w:val="0"/>
           <w:numId w:val="1"/>
         </w:numPr>
-        <w:ind w:left="426" w:hanging="426"/>
+        <w:ind w:hanging="426" w:left="426"/>
         <w:rPr>
           <w:lang w:val="en-GB"/>
         </w:rPr>
@@ -4084,12 +4694,12 @@
     </w:p>
     <w:p>
       <w:pPr>
-        <w:pStyle w:val="Nagwek2"/>
+        <w:pStyle w:val="Heading2"/>
         <w:numPr>
           <w:ilvl w:val="1"/>
           <w:numId w:val="1"/>
         </w:numPr>
-        <w:ind w:left="426" w:hanging="426"/>
+        <w:ind w:hanging="426" w:left="426"/>
         <w:jc w:val="both"/>
         <w:rPr>
           <w:lang w:val="pl-PL"/>
@@ -4103,10 +4713,10 @@
         </w:rPr>
         <w:t>Implementacja systemu</w:t>
       </w:r>
-      <w:bookmarkStart w:id="117" w:name="_Toc518373996_kopia_1_kopia_9_kopia_3_k1"/>
-      <w:bookmarkStart w:id="118" w:name="_Toc518369840_kopia_1_kopia_9_kopia_3_k1"/>
-      <w:bookmarkStart w:id="119" w:name="_Toc516650489_kopia_1_kopia_9_kopia_3_k1"/>
-      <w:bookmarkStart w:id="120" w:name="_Toc516556281_kopia_1_kopia_9_kopia_3_k1"/>
+      <w:bookmarkStart w:id="117" w:name="_Toc516556281_kopia_1_kopia_9_kopia_3_k1"/>
+      <w:bookmarkStart w:id="118" w:name="_Toc516650489_kopia_1_kopia_9_kopia_3_k1"/>
+      <w:bookmarkStart w:id="119" w:name="_Toc518369840_kopia_1_kopia_9_kopia_3_k1"/>
+      <w:bookmarkStart w:id="120" w:name="_Toc518373996_kopia_1_kopia_9_kopia_3_k1"/>
       <w:r>
         <w:rPr>
           <w:lang w:val="pl-PL"/>
@@ -4150,12 +4760,12 @@
     </w:p>
     <w:p>
       <w:pPr>
-        <w:pStyle w:val="Nagwek2"/>
+        <w:pStyle w:val="Heading2"/>
         <w:numPr>
           <w:ilvl w:val="1"/>
           <w:numId w:val="1"/>
         </w:numPr>
-        <w:ind w:left="426" w:hanging="426"/>
+        <w:ind w:hanging="426" w:left="426"/>
         <w:jc w:val="both"/>
         <w:rPr>
           <w:lang w:val="pl-PL"/>
@@ -4169,10 +4779,10 @@
         </w:rPr>
         <w:t>Testowanie</w:t>
       </w:r>
-      <w:bookmarkStart w:id="122" w:name="_Toc518373996_kopia_1_kopia_9_kopia_3_k2"/>
-      <w:bookmarkStart w:id="123" w:name="_Toc518369840_kopia_1_kopia_9_kopia_3_k2"/>
-      <w:bookmarkStart w:id="124" w:name="_Toc516650489_kopia_1_kopia_9_kopia_3_k2"/>
-      <w:bookmarkStart w:id="125" w:name="_Toc516556281_kopia_1_kopia_9_kopia_3_k2"/>
+      <w:bookmarkStart w:id="122" w:name="_Toc516556281_kopia_1_kopia_9_kopia_3_k2"/>
+      <w:bookmarkStart w:id="123" w:name="_Toc516650489_kopia_1_kopia_9_kopia_3_k2"/>
+      <w:bookmarkStart w:id="124" w:name="_Toc518369840_kopia_1_kopia_9_kopia_3_k2"/>
+      <w:bookmarkStart w:id="125" w:name="_Toc518373996_kopia_1_kopia_9_kopia_3_k2"/>
       <w:r>
         <w:rPr>
           <w:lang w:val="pl-PL"/>
@@ -4216,12 +4826,12 @@
     </w:p>
     <w:p>
       <w:pPr>
-        <w:pStyle w:val="Nagwek2"/>
+        <w:pStyle w:val="Heading2"/>
         <w:numPr>
           <w:ilvl w:val="1"/>
           <w:numId w:val="1"/>
         </w:numPr>
-        <w:ind w:left="426" w:hanging="426"/>
+        <w:ind w:hanging="426" w:left="426"/>
         <w:jc w:val="both"/>
         <w:rPr>
           <w:lang w:val="pl-PL"/>
@@ -4235,10 +4845,10 @@
         </w:rPr>
         <w:t>Weryfikacja założeń aplikacji</w:t>
       </w:r>
-      <w:bookmarkStart w:id="127" w:name="_Toc518373996_kopia_1_kopia_9_kopia_3_k3"/>
-      <w:bookmarkStart w:id="128" w:name="_Toc518369840_kopia_1_kopia_9_kopia_3_k3"/>
-      <w:bookmarkStart w:id="129" w:name="_Toc516650489_kopia_1_kopia_9_kopia_3_k3"/>
-      <w:bookmarkStart w:id="130" w:name="_Toc516556281_kopia_1_kopia_9_kopia_3_k3"/>
+      <w:bookmarkStart w:id="127" w:name="_Toc516556281_kopia_1_kopia_9_kopia_3_k3"/>
+      <w:bookmarkStart w:id="128" w:name="_Toc516650489_kopia_1_kopia_9_kopia_3_k3"/>
+      <w:bookmarkStart w:id="129" w:name="_Toc518369840_kopia_1_kopia_9_kopia_3_k3"/>
+      <w:bookmarkStart w:id="130" w:name="_Toc518373996_kopia_1_kopia_9_kopia_3_k3"/>
       <w:r>
         <w:rPr>
           <w:lang w:val="pl-PL"/>
@@ -4282,12 +4892,12 @@
     </w:p>
     <w:p>
       <w:pPr>
-        <w:pStyle w:val="Nagwek2"/>
+        <w:pStyle w:val="Heading2"/>
         <w:numPr>
           <w:ilvl w:val="1"/>
           <w:numId w:val="1"/>
         </w:numPr>
-        <w:ind w:left="426" w:hanging="426"/>
+        <w:ind w:hanging="426" w:left="426"/>
         <w:jc w:val="both"/>
         <w:rPr>
           <w:lang w:val="pl-PL"/>
@@ -4301,10 +4911,10 @@
         </w:rPr>
         <w:t>Walidacja w środowisku docelowym</w:t>
       </w:r>
-      <w:bookmarkStart w:id="132" w:name="_Toc518373996_kopia_1_kopia_9_kopia_3_k4"/>
-      <w:bookmarkStart w:id="133" w:name="_Toc518369840_kopia_1_kopia_9_kopia_3_k4"/>
-      <w:bookmarkStart w:id="134" w:name="_Toc516650489_kopia_1_kopia_9_kopia_3_k4"/>
-      <w:bookmarkStart w:id="135" w:name="_Toc516556281_kopia_1_kopia_9_kopia_3_k4"/>
+      <w:bookmarkStart w:id="132" w:name="_Toc516556281_kopia_1_kopia_9_kopia_3_k4"/>
+      <w:bookmarkStart w:id="133" w:name="_Toc516650489_kopia_1_kopia_9_kopia_3_k4"/>
+      <w:bookmarkStart w:id="134" w:name="_Toc518369840_kopia_1_kopia_9_kopia_3_k4"/>
+      <w:bookmarkStart w:id="135" w:name="_Toc518373996_kopia_1_kopia_9_kopia_3_k4"/>
       <w:r>
         <w:rPr>
           <w:lang w:val="pl-PL"/>
@@ -4348,12 +4958,12 @@
     </w:p>
     <w:p>
       <w:pPr>
-        <w:pStyle w:val="Nagwek1"/>
+        <w:pStyle w:val="Heading1"/>
         <w:numPr>
           <w:ilvl w:val="0"/>
           <w:numId w:val="1"/>
         </w:numPr>
-        <w:ind w:left="426" w:hanging="426"/>
+        <w:ind w:hanging="426" w:left="426"/>
         <w:rPr>
           <w:lang w:val="en-GB"/>
         </w:rPr>
@@ -4392,12 +5002,12 @@
     </w:p>
     <w:p>
       <w:pPr>
-        <w:pStyle w:val="Nagwek2"/>
+        <w:pStyle w:val="Heading2"/>
         <w:numPr>
           <w:ilvl w:val="1"/>
           <w:numId w:val="1"/>
         </w:numPr>
-        <w:ind w:left="426" w:hanging="426"/>
+        <w:ind w:hanging="426" w:left="426"/>
         <w:jc w:val="both"/>
         <w:rPr>
           <w:lang w:val="pl-PL"/>
@@ -4411,10 +5021,10 @@
         </w:rPr>
         <w:t>Opis przeprowadzonego badania</w:t>
       </w:r>
-      <w:bookmarkStart w:id="138" w:name="_Toc518373996_kopia_1_kopia_9_kopia_3_k5"/>
-      <w:bookmarkStart w:id="139" w:name="_Toc518369840_kopia_1_kopia_9_kopia_3_k5"/>
-      <w:bookmarkStart w:id="140" w:name="_Toc516650489_kopia_1_kopia_9_kopia_3_k5"/>
-      <w:bookmarkStart w:id="141" w:name="_Toc516556281_kopia_1_kopia_9_kopia_3_k5"/>
+      <w:bookmarkStart w:id="138" w:name="_Toc516556281_kopia_1_kopia_9_kopia_3_k5"/>
+      <w:bookmarkStart w:id="139" w:name="_Toc516650489_kopia_1_kopia_9_kopia_3_k5"/>
+      <w:bookmarkStart w:id="140" w:name="_Toc518369840_kopia_1_kopia_9_kopia_3_k5"/>
+      <w:bookmarkStart w:id="141" w:name="_Toc518373996_kopia_1_kopia_9_kopia_3_k5"/>
       <w:r>
         <w:rPr>
           <w:lang w:val="pl-PL"/>
@@ -4458,12 +5068,12 @@
     </w:p>
     <w:p>
       <w:pPr>
-        <w:pStyle w:val="Nagwek2"/>
+        <w:pStyle w:val="Heading2"/>
         <w:numPr>
           <w:ilvl w:val="1"/>
           <w:numId w:val="1"/>
         </w:numPr>
-        <w:ind w:left="426" w:hanging="426"/>
+        <w:ind w:hanging="426" w:left="426"/>
         <w:jc w:val="both"/>
         <w:rPr>
           <w:lang w:val="pl-PL"/>
@@ -4477,10 +5087,10 @@
         </w:rPr>
         <w:t>Wyniki badania i wnioski</w:t>
       </w:r>
-      <w:bookmarkStart w:id="143" w:name="_Toc518373996_kopia_1_kopia_9_kopia_3_k6"/>
-      <w:bookmarkStart w:id="144" w:name="_Toc518369840_kopia_1_kopia_9_kopia_3_k6"/>
-      <w:bookmarkStart w:id="145" w:name="_Toc516650489_kopia_1_kopia_9_kopia_3_k6"/>
-      <w:bookmarkStart w:id="146" w:name="_Toc516556281_kopia_1_kopia_9_kopia_3_k6"/>
+      <w:bookmarkStart w:id="143" w:name="_Toc516556281_kopia_1_kopia_9_kopia_3_k6"/>
+      <w:bookmarkStart w:id="144" w:name="_Toc516650489_kopia_1_kopia_9_kopia_3_k6"/>
+      <w:bookmarkStart w:id="145" w:name="_Toc518369840_kopia_1_kopia_9_kopia_3_k6"/>
+      <w:bookmarkStart w:id="146" w:name="_Toc518373996_kopia_1_kopia_9_kopia_3_k6"/>
       <w:r>
         <w:rPr>
           <w:lang w:val="pl-PL"/>
@@ -4524,12 +5134,12 @@
     </w:p>
     <w:p>
       <w:pPr>
-        <w:pStyle w:val="Nagwek1"/>
+        <w:pStyle w:val="Heading1"/>
         <w:numPr>
           <w:ilvl w:val="0"/>
           <w:numId w:val="1"/>
         </w:numPr>
-        <w:ind w:left="426" w:hanging="426"/>
+        <w:ind w:hanging="426" w:left="426"/>
         <w:rPr>
           <w:lang w:val="en-GB"/>
         </w:rPr>
@@ -4568,32 +5178,13 @@
     </w:p>
     <w:p>
       <w:pPr>
-        <w:pStyle w:val="Normal"/>
-        <w:spacing w:lineRule="auto" w:line="360" w:before="0" w:after="120"/>
-        <w:ind w:firstLine="708"/>
-        <w:jc w:val="both"/>
-        <w:rPr>
-          <w:rFonts w:ascii="Arial" w:hAnsi="Arial" w:cs="Arial"/>
-          <w:sz w:val="20"/>
-          <w:szCs w:val="20"/>
-          <w:lang w:val="en-GB"/>
-        </w:rPr>
-      </w:pPr>
-      <w:r>
-        <w:rPr>
-          <w:rFonts w:cs="Arial" w:ascii="Arial" w:hAnsi="Arial"/>
-          <w:sz w:val="20"/>
-          <w:szCs w:val="20"/>
-          <w:lang w:val="en-GB"/>
-        </w:rPr>
-      </w:r>
-    </w:p>
-    <w:p>
-      <w:pPr>
         <w:sectPr>
-          <w:footerReference w:type="even" r:id="rId8"/>
-          <w:footerReference w:type="default" r:id="rId9"/>
-          <w:footerReference w:type="first" r:id="rId10"/>
+          <w:footerReference w:type="even" r:id="rId9"/>
+          <w:footerReference w:type="default" r:id="rId10"/>
+          <w:footerReference w:type="first" r:id="rId11"/>
+          <w:footnotePr>
+            <w:numFmt w:val="chicago"/>
+          </w:footnotePr>
           <w:type w:val="nextPage"/>
           <w:pgSz w:w="11906" w:h="16838"/>
           <w:pgMar w:left="1985" w:right="1418" w:gutter="0" w:header="0" w:top="1418" w:footer="709" w:bottom="1418"/>
@@ -4624,16 +5215,16 @@
     </w:p>
     <w:p>
       <w:pPr>
-        <w:pStyle w:val="Nagwek1"/>
+        <w:pStyle w:val="Heading1"/>
         <w:rPr>
           <w:lang w:val="en-GB"/>
         </w:rPr>
       </w:pPr>
       <w:bookmarkStart w:id="148" w:name="__RefHeading___Toc631_343945465"/>
-      <w:bookmarkStart w:id="149" w:name="_Toc518374000"/>
-      <w:bookmarkStart w:id="150" w:name="_Toc518369844"/>
-      <w:bookmarkStart w:id="151" w:name="_Toc516650493"/>
-      <w:bookmarkStart w:id="152" w:name="_Toc516556285"/>
+      <w:bookmarkStart w:id="149" w:name="_Toc516556285"/>
+      <w:bookmarkStart w:id="150" w:name="_Toc516650493"/>
+      <w:bookmarkStart w:id="151" w:name="_Toc518369844"/>
+      <w:bookmarkStart w:id="152" w:name="_Toc518374000"/>
       <w:bookmarkEnd w:id="148"/>
       <w:r>
         <w:rPr>
@@ -4654,7 +5245,7 @@
           <w:tab w:val="left" w:pos="426" w:leader="none"/>
         </w:tabs>
         <w:spacing w:lineRule="auto" w:line="360"/>
-        <w:ind w:left="425" w:hanging="425"/>
+        <w:ind w:hanging="425" w:left="425"/>
         <w:jc w:val="both"/>
         <w:rPr>
           <w:rFonts w:ascii="Arial" w:hAnsi="Arial" w:cs="Arial"/>
@@ -4705,7 +5296,7 @@
           <w:tab w:val="left" w:pos="426" w:leader="none"/>
         </w:tabs>
         <w:spacing w:lineRule="auto" w:line="360"/>
-        <w:ind w:left="425" w:hanging="425"/>
+        <w:ind w:hanging="425" w:left="425"/>
         <w:jc w:val="both"/>
         <w:rPr>
           <w:rFonts w:ascii="Arial" w:hAnsi="Arial" w:cs="Arial"/>
@@ -4723,6 +5314,48 @@
         </w:rPr>
         <w:t>[2]</w:t>
         <w:tab/>
+      </w:r>
+      <w:r>
+        <w:rPr>
+          <w:rFonts w:cs="Arial" w:ascii="Arial" w:hAnsi="Arial"/>
+          <w:sz w:val="20"/>
+          <w:szCs w:val="20"/>
+          <w:lang w:val="en-GB"/>
+        </w:rPr>
+        <w:t xml:space="preserve">G. C. Burdea, P. Coiffet: </w:t>
+      </w:r>
+      <w:r>
+        <w:rPr>
+          <w:rFonts w:cs="Arial" w:ascii="Arial" w:hAnsi="Arial"/>
+          <w:i/>
+          <w:iCs/>
+          <w:sz w:val="20"/>
+          <w:szCs w:val="20"/>
+          <w:lang w:val="en-GB"/>
+        </w:rPr>
+        <w:t xml:space="preserve">Virtual Reality Technology </w:t>
+      </w:r>
+      <w:r>
+        <w:rPr>
+          <w:rFonts w:cs="Arial" w:ascii="Arial" w:hAnsi="Arial"/>
+          <w:i w:val="false"/>
+          <w:iCs w:val="false"/>
+          <w:sz w:val="20"/>
+          <w:szCs w:val="20"/>
+          <w:lang w:val="en-GB"/>
+        </w:rPr>
+        <w:t xml:space="preserve">(Second Edition). Wiley-Interscience </w:t>
+      </w:r>
+      <w:r>
+        <w:rPr>
+          <w:rFonts w:cs="Arial" w:ascii="Arial" w:hAnsi="Arial"/>
+          <w:i w:val="false"/>
+          <w:iCs w:val="false"/>
+          <w:sz w:val="20"/>
+          <w:szCs w:val="20"/>
+          <w:lang w:val="en-GB"/>
+        </w:rPr>
+        <w:t>2003</w:t>
       </w:r>
     </w:p>
     <w:p>
@@ -4733,7 +5366,7 @@
           <w:tab w:val="left" w:pos="426" w:leader="none"/>
         </w:tabs>
         <w:spacing w:lineRule="auto" w:line="360"/>
-        <w:ind w:left="425" w:hanging="425"/>
+        <w:ind w:hanging="425" w:left="425"/>
         <w:jc w:val="both"/>
         <w:rPr>
           <w:rFonts w:ascii="Arial" w:hAnsi="Arial" w:cs="Arial"/>
@@ -4756,9 +5389,12 @@
     <w:p>
       <w:pPr>
         <w:sectPr>
-          <w:footerReference w:type="even" r:id="rId11"/>
-          <w:footerReference w:type="default" r:id="rId12"/>
-          <w:footerReference w:type="first" r:id="rId13"/>
+          <w:footerReference w:type="even" r:id="rId12"/>
+          <w:footerReference w:type="default" r:id="rId13"/>
+          <w:footerReference w:type="first" r:id="rId14"/>
+          <w:footnotePr>
+            <w:numFmt w:val="chicago"/>
+          </w:footnotePr>
           <w:type w:val="nextPage"/>
           <w:pgSz w:w="11906" w:h="16838"/>
           <w:pgMar w:left="1985" w:right="1418" w:gutter="0" w:header="0" w:top="1418" w:footer="709" w:bottom="1418"/>
@@ -4773,7 +5409,7 @@
           <w:tab w:val="left" w:pos="426" w:leader="none"/>
         </w:tabs>
         <w:spacing w:lineRule="auto" w:line="360"/>
-        <w:ind w:left="425" w:hanging="425"/>
+        <w:ind w:hanging="425" w:left="425"/>
         <w:jc w:val="both"/>
         <w:rPr>
           <w:rFonts w:ascii="Arial" w:hAnsi="Arial" w:cs="Arial"/>
@@ -4795,16 +5431,16 @@
     </w:p>
     <w:p>
       <w:pPr>
-        <w:pStyle w:val="Nagwek1"/>
+        <w:pStyle w:val="Heading1"/>
         <w:rPr>
           <w:lang w:val="pl-PL"/>
         </w:rPr>
       </w:pPr>
       <w:bookmarkStart w:id="153" w:name="__RefHeading___Toc633_343945465"/>
       <w:bookmarkStart w:id="154" w:name="_Toc518374001"/>
-      <w:bookmarkStart w:id="155" w:name="_Toc518369845"/>
+      <w:bookmarkStart w:id="155" w:name="_Toc516556286"/>
       <w:bookmarkStart w:id="156" w:name="_Toc516650494"/>
-      <w:bookmarkStart w:id="157" w:name="_Toc516556286"/>
+      <w:bookmarkStart w:id="157" w:name="_Toc518369845"/>
       <w:bookmarkEnd w:id="153"/>
       <w:r>
         <w:rPr>
@@ -4814,16 +5450,16 @@
       </w:r>
       <w:r>
         <w:rPr>
-          <w:rStyle w:val="Zakotwiczenieprzypisudolnego"/>
-          <w:lang w:val="pl-PL"/>
-        </w:rPr>
-        <w:footnoteReference w:id="2"/>
-      </w:r>
-      <w:r>
-        <w:rPr>
-          <w:lang w:val="pl-PL"/>
-        </w:rPr>
-        <w:t>: Tytuł załącznika nr 1/dodatk</w:t>
+          <w:rStyle w:val="FootnoteReference"/>
+          <w:lang w:val="pl-PL"/>
+        </w:rPr>
+        <w:footnoteReference w:id="3"/>
+      </w:r>
+      <w:r>
+        <w:rPr>
+          <w:lang w:val="pl-PL"/>
+        </w:rPr>
+        <w:t>: Tytuł załącznika nr 1/dodat</w:t>
       </w:r>
       <w:bookmarkEnd w:id="155"/>
       <w:bookmarkEnd w:id="156"/>
@@ -4832,14 +5468,14 @@
         <w:rPr>
           <w:lang w:val="pl-PL"/>
         </w:rPr>
-        <w:t>u</w:t>
+        <w:t>k</w:t>
       </w:r>
       <w:bookmarkEnd w:id="154"/>
       <w:r>
         <w:rPr>
           <w:lang w:val="pl-PL"/>
         </w:rPr>
-        <w:t xml:space="preserve"> A</w:t>
+        <w:t>u A</w:t>
       </w:r>
       <w:r>
         <w:rPr>
@@ -4885,16 +5521,22 @@
         </w:rPr>
       </w:pPr>
       <w:r>
-        <w:rPr/>
+        <w:rPr>
+          <w:rFonts w:cs="Arial" w:ascii="Arial" w:hAnsi="Arial"/>
+          <w:color w:val="000000"/>
+          <w:sz w:val="20"/>
+          <w:szCs w:val="20"/>
+          <w:lang w:val="en-GB"/>
+        </w:rPr>
       </w:r>
     </w:p>
     <w:sectPr>
-      <w:headerReference w:type="even" r:id="rId14"/>
-      <w:headerReference w:type="default" r:id="rId15"/>
-      <w:headerReference w:type="first" r:id="rId16"/>
-      <w:footerReference w:type="even" r:id="rId17"/>
-      <w:footerReference w:type="default" r:id="rId18"/>
-      <w:footerReference w:type="first" r:id="rId19"/>
+      <w:headerReference w:type="even" r:id="rId15"/>
+      <w:headerReference w:type="default" r:id="rId16"/>
+      <w:headerReference w:type="first" r:id="rId17"/>
+      <w:footerReference w:type="even" r:id="rId18"/>
+      <w:footerReference w:type="default" r:id="rId19"/>
+      <w:footerReference w:type="first" r:id="rId20"/>
       <w:footnotePr>
         <w:numFmt w:val="chicago"/>
       </w:footnotePr>
@@ -4914,7 +5556,7 @@
 <w:ftr xmlns:o="urn:schemas-microsoft-com:office:office" xmlns:r="http://schemas.openxmlformats.org/officeDocument/2006/relationships" xmlns:v="urn:schemas-microsoft-com:vml" xmlns:w="http://schemas.openxmlformats.org/wordprocessingml/2006/main" xmlns:w10="urn:schemas-microsoft-com:office:word" xmlns:wp="http://schemas.openxmlformats.org/drawingml/2006/wordprocessingDrawing" xmlns:wps="http://schemas.microsoft.com/office/word/2010/wordprocessingShape" xmlns:wpg="http://schemas.microsoft.com/office/word/2010/wordprocessingGroup" xmlns:mc="http://schemas.openxmlformats.org/markup-compatibility/2006" xmlns:wp14="http://schemas.microsoft.com/office/word/2010/wordprocessingDrawing" xmlns:w14="http://schemas.microsoft.com/office/word/2010/wordml" xmlns:w15="http://schemas.microsoft.com/office/word/2012/wordml" mc:Ignorable="w14 wp14 w15">
   <w:p>
     <w:pPr>
-      <w:pStyle w:val="Stopka"/>
+      <w:pStyle w:val="Footer"/>
       <w:rPr/>
     </w:pPr>
     <w:r>
@@ -4928,7 +5570,7 @@
 <w:ftr xmlns:o="urn:schemas-microsoft-com:office:office" xmlns:r="http://schemas.openxmlformats.org/officeDocument/2006/relationships" xmlns:v="urn:schemas-microsoft-com:vml" xmlns:w="http://schemas.openxmlformats.org/wordprocessingml/2006/main" xmlns:w10="urn:schemas-microsoft-com:office:word" xmlns:wp="http://schemas.openxmlformats.org/drawingml/2006/wordprocessingDrawing" xmlns:wps="http://schemas.microsoft.com/office/word/2010/wordprocessingShape" xmlns:wpg="http://schemas.microsoft.com/office/word/2010/wordprocessingGroup" xmlns:mc="http://schemas.openxmlformats.org/markup-compatibility/2006" xmlns:wp14="http://schemas.microsoft.com/office/word/2010/wordprocessingDrawing" xmlns:w14="http://schemas.microsoft.com/office/word/2010/wordml" xmlns:w15="http://schemas.microsoft.com/office/word/2012/wordml" mc:Ignorable="w14 wp14 w15">
   <w:p>
     <w:pPr>
-      <w:pStyle w:val="Stopka"/>
+      <w:pStyle w:val="Footer"/>
       <w:rPr/>
     </w:pPr>
     <w:r>
@@ -4942,7 +5584,7 @@
 <w:ftr xmlns:o="urn:schemas-microsoft-com:office:office" xmlns:r="http://schemas.openxmlformats.org/officeDocument/2006/relationships" xmlns:v="urn:schemas-microsoft-com:vml" xmlns:w="http://schemas.openxmlformats.org/wordprocessingml/2006/main" xmlns:w10="urn:schemas-microsoft-com:office:word" xmlns:wp="http://schemas.openxmlformats.org/drawingml/2006/wordprocessingDrawing" xmlns:wps="http://schemas.microsoft.com/office/word/2010/wordprocessingShape" xmlns:wpg="http://schemas.microsoft.com/office/word/2010/wordprocessingGroup" xmlns:mc="http://schemas.openxmlformats.org/markup-compatibility/2006" xmlns:wp14="http://schemas.microsoft.com/office/word/2010/wordprocessingDrawing" xmlns:w14="http://schemas.microsoft.com/office/word/2010/wordml" xmlns:w15="http://schemas.microsoft.com/office/word/2012/wordml" mc:Ignorable="w14 wp14 w15">
   <w:p>
     <w:pPr>
-      <w:pStyle w:val="Stopka"/>
+      <w:pStyle w:val="Footer"/>
       <w:jc w:val="center"/>
       <w:rPr>
         <w:rFonts w:ascii="Arial" w:hAnsi="Arial" w:cs="Arial"/>
@@ -4963,7 +5605,7 @@
     </w:r>
     <w:r>
       <w:rPr/>
-      <w:t>14</w:t>
+      <w:t>16</w:t>
     </w:r>
     <w:r>
       <w:rPr/>
@@ -4977,7 +5619,7 @@
 <w:ftr xmlns:o="urn:schemas-microsoft-com:office:office" xmlns:r="http://schemas.openxmlformats.org/officeDocument/2006/relationships" xmlns:v="urn:schemas-microsoft-com:vml" xmlns:w="http://schemas.openxmlformats.org/wordprocessingml/2006/main" xmlns:w10="urn:schemas-microsoft-com:office:word" xmlns:wp="http://schemas.openxmlformats.org/drawingml/2006/wordprocessingDrawing" xmlns:wps="http://schemas.microsoft.com/office/word/2010/wordprocessingShape" xmlns:wpg="http://schemas.microsoft.com/office/word/2010/wordprocessingGroup" xmlns:mc="http://schemas.openxmlformats.org/markup-compatibility/2006" xmlns:wp14="http://schemas.microsoft.com/office/word/2010/wordprocessingDrawing" xmlns:w14="http://schemas.microsoft.com/office/word/2010/wordml" xmlns:w15="http://schemas.microsoft.com/office/word/2012/wordml" mc:Ignorable="w14 wp14 w15">
   <w:p>
     <w:pPr>
-      <w:pStyle w:val="Stopka"/>
+      <w:pStyle w:val="Footer"/>
       <w:jc w:val="center"/>
       <w:rPr>
         <w:rFonts w:ascii="Arial" w:hAnsi="Arial" w:cs="Arial"/>
@@ -4998,7 +5640,7 @@
     </w:r>
     <w:r>
       <w:rPr/>
-      <w:t>14</w:t>
+      <w:t>16</w:t>
     </w:r>
     <w:r>
       <w:rPr/>
@@ -5012,7 +5654,7 @@
 <w:ftr xmlns:o="urn:schemas-microsoft-com:office:office" xmlns:r="http://schemas.openxmlformats.org/officeDocument/2006/relationships" xmlns:v="urn:schemas-microsoft-com:vml" xmlns:w="http://schemas.openxmlformats.org/wordprocessingml/2006/main" xmlns:w10="urn:schemas-microsoft-com:office:word" xmlns:wp="http://schemas.openxmlformats.org/drawingml/2006/wordprocessingDrawing" xmlns:wps="http://schemas.microsoft.com/office/word/2010/wordprocessingShape" xmlns:wpg="http://schemas.microsoft.com/office/word/2010/wordprocessingGroup" xmlns:mc="http://schemas.openxmlformats.org/markup-compatibility/2006" xmlns:wp14="http://schemas.microsoft.com/office/word/2010/wordprocessingDrawing" xmlns:w14="http://schemas.microsoft.com/office/word/2010/wordml" xmlns:w15="http://schemas.microsoft.com/office/word/2012/wordml" mc:Ignorable="w14 wp14 w15">
   <w:p>
     <w:pPr>
-      <w:pStyle w:val="Stopka"/>
+      <w:pStyle w:val="Footer"/>
       <w:jc w:val="center"/>
       <w:rPr>
         <w:rFonts w:ascii="Arial" w:hAnsi="Arial" w:cs="Arial"/>
@@ -5047,7 +5689,7 @@
 <w:ftr xmlns:o="urn:schemas-microsoft-com:office:office" xmlns:r="http://schemas.openxmlformats.org/officeDocument/2006/relationships" xmlns:v="urn:schemas-microsoft-com:vml" xmlns:w="http://schemas.openxmlformats.org/wordprocessingml/2006/main" xmlns:w10="urn:schemas-microsoft-com:office:word" xmlns:wp="http://schemas.openxmlformats.org/drawingml/2006/wordprocessingDrawing" xmlns:wps="http://schemas.microsoft.com/office/word/2010/wordprocessingShape" xmlns:wpg="http://schemas.microsoft.com/office/word/2010/wordprocessingGroup" xmlns:mc="http://schemas.openxmlformats.org/markup-compatibility/2006" xmlns:wp14="http://schemas.microsoft.com/office/word/2010/wordprocessingDrawing" xmlns:w14="http://schemas.microsoft.com/office/word/2010/wordml" xmlns:w15="http://schemas.microsoft.com/office/word/2012/wordml" mc:Ignorable="w14 wp14 w15">
   <w:p>
     <w:pPr>
-      <w:pStyle w:val="Stopka"/>
+      <w:pStyle w:val="Footer"/>
       <w:jc w:val="center"/>
       <w:rPr>
         <w:rFonts w:ascii="Arial" w:hAnsi="Arial" w:cs="Arial"/>
@@ -5068,7 +5710,7 @@
     </w:r>
     <w:r>
       <w:rPr/>
-      <w:t>15</w:t>
+      <w:t>17</w:t>
     </w:r>
     <w:r>
       <w:rPr/>
@@ -5082,7 +5724,7 @@
 <w:ftr xmlns:o="urn:schemas-microsoft-com:office:office" xmlns:r="http://schemas.openxmlformats.org/officeDocument/2006/relationships" xmlns:v="urn:schemas-microsoft-com:vml" xmlns:w="http://schemas.openxmlformats.org/wordprocessingml/2006/main" xmlns:w10="urn:schemas-microsoft-com:office:word" xmlns:wp="http://schemas.openxmlformats.org/drawingml/2006/wordprocessingDrawing" xmlns:wps="http://schemas.microsoft.com/office/word/2010/wordprocessingShape" xmlns:wpg="http://schemas.microsoft.com/office/word/2010/wordprocessingGroup" xmlns:mc="http://schemas.openxmlformats.org/markup-compatibility/2006" xmlns:wp14="http://schemas.microsoft.com/office/word/2010/wordprocessingDrawing" xmlns:w14="http://schemas.microsoft.com/office/word/2010/wordml" xmlns:w15="http://schemas.microsoft.com/office/word/2012/wordml" mc:Ignorable="w14 wp14 w15">
   <w:p>
     <w:pPr>
-      <w:pStyle w:val="Stopka"/>
+      <w:pStyle w:val="Footer"/>
       <w:jc w:val="center"/>
       <w:rPr>
         <w:rFonts w:ascii="Arial" w:hAnsi="Arial" w:cs="Arial"/>
@@ -5103,7 +5745,7 @@
     </w:r>
     <w:r>
       <w:rPr/>
-      <w:t>15</w:t>
+      <w:t>17</w:t>
     </w:r>
     <w:r>
       <w:rPr/>
@@ -5117,7 +5759,7 @@
 <w:ftr xmlns:o="urn:schemas-microsoft-com:office:office" xmlns:r="http://schemas.openxmlformats.org/officeDocument/2006/relationships" xmlns:v="urn:schemas-microsoft-com:vml" xmlns:w="http://schemas.openxmlformats.org/wordprocessingml/2006/main" xmlns:w10="urn:schemas-microsoft-com:office:word" xmlns:wp="http://schemas.openxmlformats.org/drawingml/2006/wordprocessingDrawing" xmlns:wps="http://schemas.microsoft.com/office/word/2010/wordprocessingShape" xmlns:wpg="http://schemas.microsoft.com/office/word/2010/wordprocessingGroup" xmlns:mc="http://schemas.openxmlformats.org/markup-compatibility/2006" xmlns:wp14="http://schemas.microsoft.com/office/word/2010/wordprocessingDrawing" xmlns:w14="http://schemas.microsoft.com/office/word/2010/wordml" xmlns:w15="http://schemas.microsoft.com/office/word/2012/wordml" mc:Ignorable="w14 wp14 w15">
   <w:p>
     <w:pPr>
-      <w:pStyle w:val="Stopka"/>
+      <w:pStyle w:val="Footer"/>
       <w:jc w:val="center"/>
       <w:rPr>
         <w:rFonts w:ascii="Arial" w:hAnsi="Arial" w:cs="Arial"/>
@@ -5167,7 +5809,7 @@
 <w:ftr xmlns:o="urn:schemas-microsoft-com:office:office" xmlns:r="http://schemas.openxmlformats.org/officeDocument/2006/relationships" xmlns:v="urn:schemas-microsoft-com:vml" xmlns:w="http://schemas.openxmlformats.org/wordprocessingml/2006/main" xmlns:w10="urn:schemas-microsoft-com:office:word" xmlns:wp="http://schemas.openxmlformats.org/drawingml/2006/wordprocessingDrawing" xmlns:wps="http://schemas.microsoft.com/office/word/2010/wordprocessingShape" xmlns:wpg="http://schemas.microsoft.com/office/word/2010/wordprocessingGroup" xmlns:mc="http://schemas.openxmlformats.org/markup-compatibility/2006" xmlns:wp14="http://schemas.microsoft.com/office/word/2010/wordprocessingDrawing" xmlns:w14="http://schemas.microsoft.com/office/word/2010/wordml" xmlns:w15="http://schemas.microsoft.com/office/word/2012/wordml" mc:Ignorable="w14 wp14 w15">
   <w:p>
     <w:pPr>
-      <w:pStyle w:val="Stopka"/>
+      <w:pStyle w:val="Footer"/>
       <w:jc w:val="center"/>
       <w:rPr>
         <w:rFonts w:ascii="Arial" w:hAnsi="Arial" w:cs="Arial"/>
@@ -5217,7 +5859,7 @@
 <w:ftr xmlns:o="urn:schemas-microsoft-com:office:office" xmlns:r="http://schemas.openxmlformats.org/officeDocument/2006/relationships" xmlns:v="urn:schemas-microsoft-com:vml" xmlns:w="http://schemas.openxmlformats.org/wordprocessingml/2006/main" xmlns:w10="urn:schemas-microsoft-com:office:word" xmlns:wp="http://schemas.openxmlformats.org/drawingml/2006/wordprocessingDrawing" xmlns:wps="http://schemas.microsoft.com/office/word/2010/wordprocessingShape" xmlns:wpg="http://schemas.microsoft.com/office/word/2010/wordprocessingGroup" xmlns:mc="http://schemas.openxmlformats.org/markup-compatibility/2006" xmlns:wp14="http://schemas.microsoft.com/office/word/2010/wordprocessingDrawing" xmlns:w14="http://schemas.microsoft.com/office/word/2010/wordml" xmlns:w15="http://schemas.microsoft.com/office/word/2012/wordml" mc:Ignorable="w14 wp14 w15">
   <w:p>
     <w:pPr>
-      <w:pStyle w:val="Stopka"/>
+      <w:pStyle w:val="Footer"/>
       <w:rPr/>
     </w:pPr>
     <w:r>
@@ -5231,7 +5873,7 @@
 <w:ftr xmlns:o="urn:schemas-microsoft-com:office:office" xmlns:r="http://schemas.openxmlformats.org/officeDocument/2006/relationships" xmlns:v="urn:schemas-microsoft-com:vml" xmlns:w="http://schemas.openxmlformats.org/wordprocessingml/2006/main" xmlns:w10="urn:schemas-microsoft-com:office:word" xmlns:wp="http://schemas.openxmlformats.org/drawingml/2006/wordprocessingDrawing" xmlns:wps="http://schemas.microsoft.com/office/word/2010/wordprocessingShape" xmlns:wpg="http://schemas.microsoft.com/office/word/2010/wordprocessingGroup" xmlns:mc="http://schemas.openxmlformats.org/markup-compatibility/2006" xmlns:wp14="http://schemas.microsoft.com/office/word/2010/wordprocessingDrawing" xmlns:w14="http://schemas.microsoft.com/office/word/2010/wordml" xmlns:w15="http://schemas.microsoft.com/office/word/2012/wordml" mc:Ignorable="w14 wp14 w15">
   <w:p>
     <w:pPr>
-      <w:pStyle w:val="Stopka"/>
+      <w:pStyle w:val="Footer"/>
       <w:jc w:val="center"/>
       <w:rPr>
         <w:rFonts w:ascii="Arial" w:hAnsi="Arial" w:cs="Arial"/>
@@ -5266,7 +5908,7 @@
 <w:ftr xmlns:o="urn:schemas-microsoft-com:office:office" xmlns:r="http://schemas.openxmlformats.org/officeDocument/2006/relationships" xmlns:v="urn:schemas-microsoft-com:vml" xmlns:w="http://schemas.openxmlformats.org/wordprocessingml/2006/main" xmlns:w10="urn:schemas-microsoft-com:office:word" xmlns:wp="http://schemas.openxmlformats.org/drawingml/2006/wordprocessingDrawing" xmlns:wps="http://schemas.microsoft.com/office/word/2010/wordprocessingShape" xmlns:wpg="http://schemas.microsoft.com/office/word/2010/wordprocessingGroup" xmlns:mc="http://schemas.openxmlformats.org/markup-compatibility/2006" xmlns:wp14="http://schemas.microsoft.com/office/word/2010/wordprocessingDrawing" xmlns:w14="http://schemas.microsoft.com/office/word/2010/wordml" xmlns:w15="http://schemas.microsoft.com/office/word/2012/wordml" mc:Ignorable="w14 wp14 w15">
   <w:p>
     <w:pPr>
-      <w:pStyle w:val="Stopka"/>
+      <w:pStyle w:val="Footer"/>
       <w:jc w:val="center"/>
       <w:rPr>
         <w:rFonts w:ascii="Arial" w:hAnsi="Arial" w:cs="Arial"/>
@@ -5301,7 +5943,7 @@
 <w:ftr xmlns:o="urn:schemas-microsoft-com:office:office" xmlns:r="http://schemas.openxmlformats.org/officeDocument/2006/relationships" xmlns:v="urn:schemas-microsoft-com:vml" xmlns:w="http://schemas.openxmlformats.org/wordprocessingml/2006/main" xmlns:w10="urn:schemas-microsoft-com:office:word" xmlns:wp="http://schemas.openxmlformats.org/drawingml/2006/wordprocessingDrawing" xmlns:wps="http://schemas.microsoft.com/office/word/2010/wordprocessingShape" xmlns:wpg="http://schemas.microsoft.com/office/word/2010/wordprocessingGroup" xmlns:mc="http://schemas.openxmlformats.org/markup-compatibility/2006" xmlns:wp14="http://schemas.microsoft.com/office/word/2010/wordprocessingDrawing" xmlns:w14="http://schemas.microsoft.com/office/word/2010/wordml" xmlns:w15="http://schemas.microsoft.com/office/word/2012/wordml" mc:Ignorable="w14 wp14 w15">
   <w:p>
     <w:pPr>
-      <w:pStyle w:val="Stopka"/>
+      <w:pStyle w:val="Footer"/>
       <w:rPr/>
     </w:pPr>
     <w:r>
@@ -5315,7 +5957,7 @@
 <w:ftr xmlns:o="urn:schemas-microsoft-com:office:office" xmlns:r="http://schemas.openxmlformats.org/officeDocument/2006/relationships" xmlns:v="urn:schemas-microsoft-com:vml" xmlns:w="http://schemas.openxmlformats.org/wordprocessingml/2006/main" xmlns:w10="urn:schemas-microsoft-com:office:word" xmlns:wp="http://schemas.openxmlformats.org/drawingml/2006/wordprocessingDrawing" xmlns:wps="http://schemas.microsoft.com/office/word/2010/wordprocessingShape" xmlns:wpg="http://schemas.microsoft.com/office/word/2010/wordprocessingGroup" xmlns:mc="http://schemas.openxmlformats.org/markup-compatibility/2006" xmlns:wp14="http://schemas.microsoft.com/office/word/2010/wordprocessingDrawing" xmlns:w14="http://schemas.microsoft.com/office/word/2010/wordml" xmlns:w15="http://schemas.microsoft.com/office/word/2012/wordml" mc:Ignorable="w14 wp14 w15">
   <w:p>
     <w:pPr>
-      <w:pStyle w:val="Stopka"/>
+      <w:pStyle w:val="Footer"/>
       <w:jc w:val="center"/>
       <w:rPr>
         <w:rFonts w:ascii="Arial" w:hAnsi="Arial" w:cs="Arial"/>
@@ -5336,7 +5978,7 @@
     </w:r>
     <w:r>
       <w:rPr/>
-      <w:t>13</w:t>
+      <w:t>15</w:t>
     </w:r>
     <w:r>
       <w:rPr/>
@@ -5350,7 +5992,7 @@
 <w:ftr xmlns:o="urn:schemas-microsoft-com:office:office" xmlns:r="http://schemas.openxmlformats.org/officeDocument/2006/relationships" xmlns:v="urn:schemas-microsoft-com:vml" xmlns:w="http://schemas.openxmlformats.org/wordprocessingml/2006/main" xmlns:w10="urn:schemas-microsoft-com:office:word" xmlns:wp="http://schemas.openxmlformats.org/drawingml/2006/wordprocessingDrawing" xmlns:wps="http://schemas.microsoft.com/office/word/2010/wordprocessingShape" xmlns:wpg="http://schemas.microsoft.com/office/word/2010/wordprocessingGroup" xmlns:mc="http://schemas.openxmlformats.org/markup-compatibility/2006" xmlns:wp14="http://schemas.microsoft.com/office/word/2010/wordprocessingDrawing" xmlns:w14="http://schemas.microsoft.com/office/word/2010/wordml" xmlns:w15="http://schemas.microsoft.com/office/word/2012/wordml" mc:Ignorable="w14 wp14 w15">
   <w:p>
     <w:pPr>
-      <w:pStyle w:val="Stopka"/>
+      <w:pStyle w:val="Footer"/>
       <w:jc w:val="center"/>
       <w:rPr>
         <w:rFonts w:ascii="Arial" w:hAnsi="Arial" w:cs="Arial"/>
@@ -5371,7 +6013,7 @@
     </w:r>
     <w:r>
       <w:rPr/>
-      <w:t>13</w:t>
+      <w:t>15</w:t>
     </w:r>
     <w:r>
       <w:rPr/>
@@ -5410,7 +6052,31 @@
   <w:footnote w:id="2">
     <w:p>
       <w:pPr>
-        <w:pStyle w:val="Przypisdolny"/>
+        <w:pStyle w:val="FootnoteText"/>
+        <w:rPr/>
+      </w:pPr>
+      <w:r>
+        <w:rPr>
+          <w:rStyle w:val="Znakiprzypiswdolnych"/>
+        </w:rPr>
+        <w:footnoteRef/>
+      </w:r>
+      <w:r>
+        <w:rPr/>
+        <w:t>Źródło: https://www.historyofinformation.com/image.php?id=2078</w:t>
+      </w:r>
+      <w:hyperlink r:id="rId1">
+        <w:r>
+          <w:rPr/>
+          <w:t xml:space="preserve"> (dostęp: 14.05.2026)</w:t>
+        </w:r>
+      </w:hyperlink>
+    </w:p>
+  </w:footnote>
+  <w:footnote w:id="3">
+    <w:p>
+      <w:pPr>
+        <w:pStyle w:val="FootnoteText"/>
         <w:rPr>
           <w:rFonts w:ascii="Arial" w:hAnsi="Arial" w:cs="Arial"/>
           <w:sz w:val="16"/>
@@ -5442,7 +6108,7 @@
 <w:hdr xmlns:o="urn:schemas-microsoft-com:office:office" xmlns:r="http://schemas.openxmlformats.org/officeDocument/2006/relationships" xmlns:v="urn:schemas-microsoft-com:vml" xmlns:w="http://schemas.openxmlformats.org/wordprocessingml/2006/main" xmlns:w10="urn:schemas-microsoft-com:office:word" xmlns:wp="http://schemas.openxmlformats.org/drawingml/2006/wordprocessingDrawing" xmlns:wps="http://schemas.microsoft.com/office/word/2010/wordprocessingShape" xmlns:wpg="http://schemas.microsoft.com/office/word/2010/wordprocessingGroup" xmlns:mc="http://schemas.openxmlformats.org/markup-compatibility/2006" xmlns:wp14="http://schemas.microsoft.com/office/word/2010/wordprocessingDrawing" xmlns:w14="http://schemas.microsoft.com/office/word/2010/wordml" xmlns:w15="http://schemas.microsoft.com/office/word/2012/wordml" mc:Ignorable="w14 wp14 w15">
   <w:p>
     <w:pPr>
-      <w:pStyle w:val="Gwka"/>
+      <w:pStyle w:val="Header"/>
       <w:rPr/>
     </w:pPr>
     <w:r>
@@ -5456,7 +6122,7 @@
 <w:hdr xmlns:o="urn:schemas-microsoft-com:office:office" xmlns:r="http://schemas.openxmlformats.org/officeDocument/2006/relationships" xmlns:v="urn:schemas-microsoft-com:vml" xmlns:w="http://schemas.openxmlformats.org/wordprocessingml/2006/main" xmlns:w10="urn:schemas-microsoft-com:office:word" xmlns:wp="http://schemas.openxmlformats.org/drawingml/2006/wordprocessingDrawing" xmlns:wps="http://schemas.microsoft.com/office/word/2010/wordprocessingShape" xmlns:wpg="http://schemas.microsoft.com/office/word/2010/wordprocessingGroup" xmlns:mc="http://schemas.openxmlformats.org/markup-compatibility/2006" xmlns:wp14="http://schemas.microsoft.com/office/word/2010/wordprocessingDrawing" xmlns:w14="http://schemas.microsoft.com/office/word/2010/wordml" xmlns:w15="http://schemas.microsoft.com/office/word/2012/wordml" mc:Ignorable="w14 wp14 w15">
   <w:p>
     <w:pPr>
-      <w:pStyle w:val="Gwka"/>
+      <w:pStyle w:val="Header"/>
       <w:rPr/>
     </w:pPr>
     <w:r>
@@ -5470,7 +6136,7 @@
 <w:hdr xmlns:o="urn:schemas-microsoft-com:office:office" xmlns:r="http://schemas.openxmlformats.org/officeDocument/2006/relationships" xmlns:v="urn:schemas-microsoft-com:vml" xmlns:w="http://schemas.openxmlformats.org/wordprocessingml/2006/main" xmlns:w10="urn:schemas-microsoft-com:office:word" xmlns:wp="http://schemas.openxmlformats.org/drawingml/2006/wordprocessingDrawing" xmlns:wps="http://schemas.microsoft.com/office/word/2010/wordprocessingShape" xmlns:wpg="http://schemas.microsoft.com/office/word/2010/wordprocessingGroup" xmlns:mc="http://schemas.openxmlformats.org/markup-compatibility/2006" xmlns:wp14="http://schemas.microsoft.com/office/word/2010/wordprocessingDrawing" xmlns:w14="http://schemas.microsoft.com/office/word/2010/wordml" xmlns:w15="http://schemas.microsoft.com/office/word/2012/wordml" mc:Ignorable="w14 wp14 w15">
   <w:p>
     <w:pPr>
-      <w:pStyle w:val="Gwka"/>
+      <w:pStyle w:val="Header"/>
       <w:rPr/>
     </w:pPr>
     <w:r>
@@ -5909,7 +6575,7 @@
       <w:lang w:val="pl-PL" w:eastAsia="en-US" w:bidi="ar-SA"/>
     </w:rPr>
   </w:style>
-  <w:style w:type="paragraph" w:styleId="Nagwek1">
+  <w:style w:type="paragraph" w:styleId="Heading1">
     <w:name w:val="Heading 1"/>
     <w:basedOn w:val="Normal"/>
     <w:next w:val="Normal"/>
@@ -5932,7 +6598,7 @@
       <w:lang w:val="x-none"/>
     </w:rPr>
   </w:style>
-  <w:style w:type="paragraph" w:styleId="Nagwek2">
+  <w:style w:type="paragraph" w:styleId="Heading2">
     <w:name w:val="Heading 2"/>
     <w:basedOn w:val="Normal"/>
     <w:link w:val="Nagwek2Znak"/>
@@ -5953,7 +6619,7 @@
       <w:lang w:val="x-none" w:eastAsia="x-none"/>
     </w:rPr>
   </w:style>
-  <w:style w:type="paragraph" w:styleId="Nagwek3">
+  <w:style w:type="paragraph" w:styleId="Heading3">
     <w:name w:val="Heading 3"/>
     <w:basedOn w:val="Normal"/>
     <w:next w:val="Normal"/>
@@ -6136,13 +6802,13 @@
       <w:vertAlign w:val="superscript"/>
     </w:rPr>
   </w:style>
-  <w:style w:type="character" w:styleId="Zakotwiczenieprzypisudolnego">
+  <w:style w:type="character" w:styleId="FootnoteReference">
     <w:name w:val="Footnote Reference"/>
     <w:rPr>
       <w:vertAlign w:val="superscript"/>
     </w:rPr>
   </w:style>
-  <w:style w:type="character" w:styleId="Czeinternetowe">
+  <w:style w:type="character" w:styleId="Hyperlink">
     <w:name w:val="Hyperlink"/>
     <w:uiPriority w:val="99"/>
     <w:rsid w:val="000c4900"/>
@@ -6179,7 +6845,7 @@
     <w:qFormat/>
     <w:rPr/>
   </w:style>
-  <w:style w:type="character" w:styleId="Wyrnienie">
+  <w:style w:type="character" w:styleId="Emphasis">
     <w:name w:val="Emphasis"/>
     <w:qFormat/>
     <w:rPr>
@@ -6194,7 +6860,7 @@
       <w:vertAlign w:val="superscript"/>
     </w:rPr>
   </w:style>
-  <w:style w:type="character" w:styleId="Zakotwiczenieprzypisukocowego">
+  <w:style w:type="character" w:styleId="EndnoteReference">
     <w:name w:val="Endnote Reference"/>
     <w:rPr>
       <w:vertAlign w:val="superscript"/>
@@ -6203,7 +6869,7 @@
   <w:style w:type="paragraph" w:styleId="Nagwek">
     <w:name w:val="Nagłówek"/>
     <w:basedOn w:val="Normal"/>
-    <w:next w:val="Tretekstu"/>
+    <w:next w:val="BodyText"/>
     <w:qFormat/>
     <w:pPr>
       <w:keepNext w:val="true"/>
@@ -6215,7 +6881,7 @@
       <w:szCs w:val="28"/>
     </w:rPr>
   </w:style>
-  <w:style w:type="paragraph" w:styleId="Tretekstu">
+  <w:style w:type="paragraph" w:styleId="BodyText">
     <w:name w:val="Body Text"/>
     <w:basedOn w:val="Normal"/>
     <w:link w:val="TekstpodstawowyZnak"/>
@@ -6223,7 +6889,7 @@
     <w:rsid w:val="00b87c5d"/>
     <w:pPr>
       <w:spacing w:lineRule="auto" w:line="360"/>
-      <w:ind w:right="178" w:hanging="0"/>
+      <w:ind w:hanging="0" w:right="178"/>
       <w:jc w:val="both"/>
     </w:pPr>
     <w:rPr>
@@ -6233,15 +6899,15 @@
       <w:lang w:val="x-none" w:eastAsia="x-none"/>
     </w:rPr>
   </w:style>
-  <w:style w:type="paragraph" w:styleId="Lista">
+  <w:style w:type="paragraph" w:styleId="List">
     <w:name w:val="List"/>
-    <w:basedOn w:val="Tretekstu"/>
+    <w:basedOn w:val="BodyText"/>
     <w:pPr/>
     <w:rPr>
       <w:rFonts w:cs="Arial"/>
     </w:rPr>
   </w:style>
-  <w:style w:type="paragraph" w:styleId="Podpis">
+  <w:style w:type="paragraph" w:styleId="Caption">
     <w:name w:val="Caption"/>
     <w:basedOn w:val="Normal"/>
     <w:qFormat/>
@@ -6275,7 +6941,7 @@
     <w:pPr/>
     <w:rPr/>
   </w:style>
-  <w:style w:type="paragraph" w:styleId="Gwka">
+  <w:style w:type="paragraph" w:styleId="Header">
     <w:name w:val="Header"/>
     <w:basedOn w:val="Normal"/>
     <w:link w:val="NagwekZnak"/>
@@ -6293,7 +6959,7 @@
       <w:lang w:val="x-none"/>
     </w:rPr>
   </w:style>
-  <w:style w:type="paragraph" w:styleId="Stopka">
+  <w:style w:type="paragraph" w:styleId="Footer">
     <w:name w:val="Footer"/>
     <w:basedOn w:val="Normal"/>
     <w:link w:val="StopkaZnak"/>
@@ -6369,7 +7035,7 @@
     <w:qFormat/>
     <w:rsid w:val="00107ae7"/>
     <w:pPr>
-      <w:ind w:left="708" w:hanging="0"/>
+      <w:ind w:hanging="0" w:left="708"/>
     </w:pPr>
     <w:rPr/>
   </w:style>
@@ -6426,15 +7092,15 @@
       <w:lang w:val="x-none"/>
     </w:rPr>
   </w:style>
-  <w:style w:type="paragraph" w:styleId="Nagwekindeksu">
+  <w:style w:type="paragraph" w:styleId="IndexHeading">
     <w:name w:val="Index Heading"/>
     <w:basedOn w:val="Nagwek"/>
     <w:pPr/>
     <w:rPr/>
   </w:style>
-  <w:style w:type="paragraph" w:styleId="Nagwekspisutreci">
+  <w:style w:type="paragraph" w:styleId="TOCHeading">
     <w:name w:val="TOC Heading"/>
-    <w:basedOn w:val="Nagwek1"/>
+    <w:basedOn w:val="Heading1"/>
     <w:next w:val="Normal"/>
     <w:uiPriority w:val="39"/>
     <w:qFormat/>
@@ -6447,7 +7113,7 @@
       <w:lang w:val="en-GB"/>
     </w:rPr>
   </w:style>
-  <w:style w:type="paragraph" w:styleId="Przypisdolny">
+  <w:style w:type="paragraph" w:styleId="FootnoteText">
     <w:name w:val="Footnote Text"/>
     <w:basedOn w:val="Normal"/>
     <w:link w:val="TekstprzypisudolnegoZnak"/>
@@ -6465,7 +7131,7 @@
       <w:lang w:val="x-none" w:eastAsia="x-none"/>
     </w:rPr>
   </w:style>
-  <w:style w:type="paragraph" w:styleId="Spistreci1">
+  <w:style w:type="paragraph" w:styleId="TOC1">
     <w:name w:val="TOC 1"/>
     <w:basedOn w:val="Normal"/>
     <w:next w:val="Normal"/>
@@ -6480,7 +7146,7 @@
         <w:tab w:val="right" w:pos="9060" w:leader="dot"/>
       </w:tabs>
       <w:spacing w:lineRule="auto" w:line="360" w:before="0" w:after="120"/>
-      <w:ind w:left="426" w:hanging="426"/>
+      <w:ind w:hanging="426" w:left="426"/>
       <w:jc w:val="both"/>
     </w:pPr>
     <w:rPr>
@@ -6489,7 +7155,7 @@
       <w:szCs w:val="20"/>
     </w:rPr>
   </w:style>
-  <w:style w:type="paragraph" w:styleId="Spistreci2">
+  <w:style w:type="paragraph" w:styleId="TOC2">
     <w:name w:val="TOC 2"/>
     <w:basedOn w:val="Normal"/>
     <w:next w:val="Normal"/>
@@ -6504,14 +7170,14 @@
         <w:tab w:val="right" w:pos="9060" w:leader="dot"/>
       </w:tabs>
       <w:spacing w:lineRule="auto" w:line="360" w:before="0" w:after="120"/>
-      <w:ind w:left="993" w:hanging="567"/>
+      <w:ind w:hanging="567" w:left="993"/>
       <w:jc w:val="both"/>
     </w:pPr>
     <w:rPr/>
   </w:style>
-  <w:style w:type="paragraph" w:styleId="Tytu">
+  <w:style w:type="paragraph" w:styleId="Title">
     <w:name w:val="Title"/>
-    <w:basedOn w:val="Nagwekspisutreci"/>
+    <w:basedOn w:val="TOCHeading"/>
     <w:next w:val="Normal"/>
     <w:link w:val="TytuZnak"/>
     <w:uiPriority w:val="10"/>
@@ -6528,7 +7194,7 @@
       <w:lang w:val="pl-PL"/>
     </w:rPr>
   </w:style>
-  <w:style w:type="paragraph" w:styleId="Spistreci3">
+  <w:style w:type="paragraph" w:styleId="TOC3">
     <w:name w:val="TOC 3"/>
     <w:basedOn w:val="Normal"/>
     <w:next w:val="Normal"/>
@@ -6543,7 +7209,7 @@
         <w:tab w:val="right" w:pos="9060" w:leader="dot"/>
       </w:tabs>
       <w:spacing w:lineRule="auto" w:line="360" w:before="0" w:after="100"/>
-      <w:ind w:left="400" w:firstLine="593"/>
+      <w:ind w:firstLine="593" w:left="400"/>
       <w:jc w:val="both"/>
     </w:pPr>
     <w:rPr>

</xml_diff>